<commit_message>
docs: complementa documentação técnica da IHMInvest multicloud
</commit_message>
<xml_diff>
--- a/Documentacao_Tecnica_IHMInvest_Multicloud.docx
+++ b/Documentacao_Tecnica_IHMInvest_Multicloud.docx
@@ -212,7 +212,27 @@
           <w:color w:val="000000" w:themeColor="text1"/>
           <w:sz w:val="22"/>
         </w:rPr>
-        <w:t xml:space="preserve">Grupo A — Análise e </w:t>
+        <w:t xml:space="preserve">Grupo A — </w:t>
+      </w:r>
+      <w:proofErr w:type="spellStart"/>
+      <w:r>
+        <w:rPr>
+          <w:rFonts w:cs="Arial"/>
+          <w:b/>
+          <w:color w:val="000000" w:themeColor="text1"/>
+          <w:sz w:val="22"/>
+        </w:rPr>
+        <w:t>Análise</w:t>
+      </w:r>
+      <w:proofErr w:type="spellEnd"/>
+      <w:r>
+        <w:rPr>
+          <w:rFonts w:cs="Arial"/>
+          <w:b/>
+          <w:color w:val="000000" w:themeColor="text1"/>
+          <w:sz w:val="22"/>
+        </w:rPr>
+        <w:t xml:space="preserve"> e </w:t>
       </w:r>
       <w:proofErr w:type="spellStart"/>
       <w:r>
@@ -711,7 +731,23 @@
           <w:rFonts w:cs="Arial"/>
           <w:color w:val="000000" w:themeColor="text1"/>
         </w:rPr>
-        <w:t xml:space="preserve"> apresentação dos </w:t>
+        <w:t xml:space="preserve"> </w:t>
+      </w:r>
+      <w:proofErr w:type="spellStart"/>
+      <w:r>
+        <w:rPr>
+          <w:rFonts w:cs="Arial"/>
+          <w:color w:val="000000" w:themeColor="text1"/>
+        </w:rPr>
+        <w:t>apresentação</w:t>
+      </w:r>
+      <w:proofErr w:type="spellEnd"/>
+      <w:r>
+        <w:rPr>
+          <w:rFonts w:cs="Arial"/>
+          <w:color w:val="000000" w:themeColor="text1"/>
+        </w:rPr>
+        <w:t xml:space="preserve"> dos </w:t>
       </w:r>
       <w:proofErr w:type="spellStart"/>
       <w:r>
@@ -1286,7 +1322,55 @@
           <w:rFonts w:cs="Arial"/>
           <w:color w:val="000000" w:themeColor="text1"/>
         </w:rPr>
-        <w:t xml:space="preserve">As três funções expõem endpoints HTTP do método POST e recebem dados JSON. As respostas de sucesso usam HTTP 200; entradas inválidas devem retornar HTTP 400 e falhas internas, HTTP 500. Os exemplos abaixo definem os </w:t>
+        <w:t xml:space="preserve">As três funções expõem endpoints HTTP do método POST e recebem dados JSON. As respostas de sucesso usam HTTP 200; entradas inválidas devem retornar HTTP 400 e falhas internas, HTTP 500. Os exemplos </w:t>
+      </w:r>
+      <w:proofErr w:type="spellStart"/>
+      <w:r>
+        <w:rPr>
+          <w:rFonts w:cs="Arial"/>
+          <w:color w:val="000000" w:themeColor="text1"/>
+        </w:rPr>
+        <w:t>abaixo</w:t>
+      </w:r>
+      <w:proofErr w:type="spellEnd"/>
+      <w:r>
+        <w:rPr>
+          <w:rFonts w:cs="Arial"/>
+          <w:color w:val="000000" w:themeColor="text1"/>
+        </w:rPr>
+        <w:t xml:space="preserve"> </w:t>
+      </w:r>
+      <w:proofErr w:type="spellStart"/>
+      <w:r>
+        <w:rPr>
+          <w:rFonts w:cs="Arial"/>
+          <w:color w:val="000000" w:themeColor="text1"/>
+        </w:rPr>
+        <w:t>definem</w:t>
+      </w:r>
+      <w:proofErr w:type="spellEnd"/>
+      <w:r>
+        <w:rPr>
+          <w:rFonts w:cs="Arial"/>
+          <w:color w:val="000000" w:themeColor="text1"/>
+        </w:rPr>
+        <w:t xml:space="preserve"> </w:t>
+      </w:r>
+      <w:proofErr w:type="spellStart"/>
+      <w:r>
+        <w:rPr>
+          <w:rFonts w:cs="Arial"/>
+          <w:color w:val="000000" w:themeColor="text1"/>
+        </w:rPr>
+        <w:t>os</w:t>
+      </w:r>
+      <w:proofErr w:type="spellEnd"/>
+      <w:r>
+        <w:rPr>
+          <w:rFonts w:cs="Arial"/>
+          <w:color w:val="000000" w:themeColor="text1"/>
+        </w:rPr>
+        <w:t xml:space="preserve"> </w:t>
       </w:r>
       <w:proofErr w:type="spellStart"/>
       <w:r>
@@ -1626,7 +1710,7 @@
           <w:rFonts w:cs="Arial"/>
           <w:color w:val="000000" w:themeColor="text1"/>
         </w:rPr>
-        <w:t>Método: POST. Rota lógica: /api/conversorInternacional. O frontend do repositório contém o seguinte endereço configurado:</w:t>
+        <w:t xml:space="preserve">Método: POST. </w:t>
       </w:r>
     </w:p>
     <w:tbl>
@@ -1680,13 +1764,37 @@
           <w:color w:val="000000" w:themeColor="text1"/>
         </w:rPr>
       </w:pPr>
+    </w:p>
+    <w:p>
+      <w:pPr>
+        <w:rPr>
+          <w:rFonts w:cs="Arial"/>
+          <w:color w:val="000000" w:themeColor="text1"/>
+        </w:rPr>
+      </w:pPr>
       <w:r>
         <w:rPr>
           <w:rFonts w:cs="Arial"/>
           <w:color w:val="000000" w:themeColor="text1"/>
         </w:rPr>
         <w:lastRenderedPageBreak/>
-        <w:t>Request — exemplo de entrada:</w:t>
+        <w:t xml:space="preserve">Request — </w:t>
+      </w:r>
+      <w:proofErr w:type="spellStart"/>
+      <w:r>
+        <w:rPr>
+          <w:rFonts w:cs="Arial"/>
+          <w:color w:val="000000" w:themeColor="text1"/>
+        </w:rPr>
+        <w:t>exemplo</w:t>
+      </w:r>
+      <w:proofErr w:type="spellEnd"/>
+      <w:r>
+        <w:rPr>
+          <w:rFonts w:cs="Arial"/>
+          <w:color w:val="000000" w:themeColor="text1"/>
+        </w:rPr>
+        <w:t xml:space="preserve"> de entrada:</w:t>
       </w:r>
     </w:p>
     <w:tbl>
@@ -1814,6 +1922,7 @@
               <w:rPr>
                 <w:rFonts w:cs="Arial"/>
                 <w:color w:val="000000" w:themeColor="text1"/>
+                <w:sz w:val="17"/>
               </w:rPr>
             </w:pPr>
             <w:r>
@@ -1831,7 +1940,6 @@
                 <w:sz w:val="17"/>
               </w:rPr>
               <w:br/>
-              <w:t xml:space="preserve">  "valorDolar": 9090.91,</w:t>
             </w:r>
             <w:r>
               <w:rPr>
@@ -1839,8 +1947,7 @@
                 <w:color w:val="000000" w:themeColor="text1"/>
                 <w:sz w:val="17"/>
               </w:rPr>
-              <w:br/>
-              <w:t xml:space="preserve">  "valorEuro": 8333.33,</w:t>
+              <w:t xml:space="preserve">  </w:t>
             </w:r>
             <w:r>
               <w:rPr>
@@ -1848,17 +1955,240 @@
                 <w:color w:val="000000" w:themeColor="text1"/>
                 <w:sz w:val="17"/>
               </w:rPr>
-              <w:br/>
-              <w:t xml:space="preserve">  "cotacaoDolar": 5.50,</w:t>
+              <w:t>"</w:t>
             </w:r>
+            <w:proofErr w:type="spellStart"/>
             <w:r>
               <w:rPr>
                 <w:rFonts w:cs="Arial"/>
                 <w:color w:val="000000" w:themeColor="text1"/>
                 <w:sz w:val="17"/>
               </w:rPr>
-              <w:br/>
-              <w:t xml:space="preserve">  "cotacaoEuro": 6.00</w:t>
+              <w:t>provedor</w:t>
+            </w:r>
+            <w:proofErr w:type="spellEnd"/>
+            <w:r>
+              <w:rPr>
+                <w:rFonts w:cs="Arial"/>
+                <w:color w:val="000000" w:themeColor="text1"/>
+                <w:sz w:val="17"/>
+              </w:rPr>
+              <w:t>": "Azure",</w:t>
+            </w:r>
+          </w:p>
+          <w:p>
+            <w:pPr>
+              <w:spacing w:after="0"/>
+              <w:rPr>
+                <w:rFonts w:cs="Arial"/>
+                <w:color w:val="000000" w:themeColor="text1"/>
+                <w:sz w:val="17"/>
+              </w:rPr>
+            </w:pPr>
+            <w:r>
+              <w:rPr>
+                <w:rFonts w:cs="Arial"/>
+                <w:color w:val="000000" w:themeColor="text1"/>
+                <w:sz w:val="17"/>
+              </w:rPr>
+              <w:t xml:space="preserve">  "</w:t>
+            </w:r>
+            <w:proofErr w:type="spellStart"/>
+            <w:r>
+              <w:rPr>
+                <w:rFonts w:cs="Arial"/>
+                <w:color w:val="000000" w:themeColor="text1"/>
+                <w:sz w:val="17"/>
+              </w:rPr>
+              <w:t>valorReais</w:t>
+            </w:r>
+            <w:proofErr w:type="spellEnd"/>
+            <w:r>
+              <w:rPr>
+                <w:rFonts w:cs="Arial"/>
+                <w:color w:val="000000" w:themeColor="text1"/>
+                <w:sz w:val="17"/>
+              </w:rPr>
+              <w:t>": 1000,</w:t>
+            </w:r>
+          </w:p>
+          <w:p>
+            <w:pPr>
+              <w:spacing w:after="0"/>
+              <w:rPr>
+                <w:rFonts w:cs="Arial"/>
+                <w:color w:val="000000" w:themeColor="text1"/>
+                <w:sz w:val="17"/>
+              </w:rPr>
+            </w:pPr>
+            <w:r>
+              <w:rPr>
+                <w:rFonts w:cs="Arial"/>
+                <w:color w:val="000000" w:themeColor="text1"/>
+                <w:sz w:val="17"/>
+              </w:rPr>
+              <w:t xml:space="preserve">  "</w:t>
+            </w:r>
+            <w:proofErr w:type="spellStart"/>
+            <w:r>
+              <w:rPr>
+                <w:rFonts w:cs="Arial"/>
+                <w:color w:val="000000" w:themeColor="text1"/>
+                <w:sz w:val="17"/>
+              </w:rPr>
+              <w:t>valorDolar</w:t>
+            </w:r>
+            <w:proofErr w:type="spellEnd"/>
+            <w:r>
+              <w:rPr>
+                <w:rFonts w:cs="Arial"/>
+                <w:color w:val="000000" w:themeColor="text1"/>
+                <w:sz w:val="17"/>
+              </w:rPr>
+              <w:t>": 200,</w:t>
+            </w:r>
+          </w:p>
+          <w:p>
+            <w:pPr>
+              <w:spacing w:after="0"/>
+              <w:rPr>
+                <w:rFonts w:cs="Arial"/>
+                <w:color w:val="000000" w:themeColor="text1"/>
+                <w:sz w:val="17"/>
+              </w:rPr>
+            </w:pPr>
+            <w:r>
+              <w:rPr>
+                <w:rFonts w:cs="Arial"/>
+                <w:color w:val="000000" w:themeColor="text1"/>
+                <w:sz w:val="17"/>
+              </w:rPr>
+              <w:t xml:space="preserve">  "</w:t>
+            </w:r>
+            <w:proofErr w:type="spellStart"/>
+            <w:r>
+              <w:rPr>
+                <w:rFonts w:cs="Arial"/>
+                <w:color w:val="000000" w:themeColor="text1"/>
+                <w:sz w:val="17"/>
+              </w:rPr>
+              <w:t>valorEuro</w:t>
+            </w:r>
+            <w:proofErr w:type="spellEnd"/>
+            <w:r>
+              <w:rPr>
+                <w:rFonts w:cs="Arial"/>
+                <w:color w:val="000000" w:themeColor="text1"/>
+                <w:sz w:val="17"/>
+              </w:rPr>
+              <w:t>": 160,</w:t>
+            </w:r>
+          </w:p>
+          <w:p>
+            <w:pPr>
+              <w:spacing w:after="0"/>
+              <w:rPr>
+                <w:rFonts w:cs="Arial"/>
+                <w:color w:val="000000" w:themeColor="text1"/>
+                <w:sz w:val="17"/>
+              </w:rPr>
+            </w:pPr>
+            <w:r>
+              <w:rPr>
+                <w:rFonts w:cs="Arial"/>
+                <w:color w:val="000000" w:themeColor="text1"/>
+                <w:sz w:val="17"/>
+              </w:rPr>
+              <w:t xml:space="preserve">  "</w:t>
+            </w:r>
+            <w:proofErr w:type="spellStart"/>
+            <w:r>
+              <w:rPr>
+                <w:rFonts w:cs="Arial"/>
+                <w:color w:val="000000" w:themeColor="text1"/>
+                <w:sz w:val="17"/>
+              </w:rPr>
+              <w:t>cotacaoDolar</w:t>
+            </w:r>
+            <w:proofErr w:type="spellEnd"/>
+            <w:r>
+              <w:rPr>
+                <w:rFonts w:cs="Arial"/>
+                <w:color w:val="000000" w:themeColor="text1"/>
+                <w:sz w:val="17"/>
+              </w:rPr>
+              <w:t>": 5,</w:t>
+            </w:r>
+          </w:p>
+          <w:p>
+            <w:pPr>
+              <w:spacing w:after="0"/>
+              <w:rPr>
+                <w:rFonts w:cs="Arial"/>
+                <w:color w:val="000000" w:themeColor="text1"/>
+                <w:sz w:val="17"/>
+              </w:rPr>
+            </w:pPr>
+            <w:r>
+              <w:rPr>
+                <w:rFonts w:cs="Arial"/>
+                <w:color w:val="000000" w:themeColor="text1"/>
+                <w:sz w:val="17"/>
+              </w:rPr>
+              <w:t xml:space="preserve">  "</w:t>
+            </w:r>
+            <w:proofErr w:type="spellStart"/>
+            <w:r>
+              <w:rPr>
+                <w:rFonts w:cs="Arial"/>
+                <w:color w:val="000000" w:themeColor="text1"/>
+                <w:sz w:val="17"/>
+              </w:rPr>
+              <w:t>cotacaoEuro</w:t>
+            </w:r>
+            <w:proofErr w:type="spellEnd"/>
+            <w:r>
+              <w:rPr>
+                <w:rFonts w:cs="Arial"/>
+                <w:color w:val="000000" w:themeColor="text1"/>
+                <w:sz w:val="17"/>
+              </w:rPr>
+              <w:t>": 6.25,</w:t>
+            </w:r>
+          </w:p>
+          <w:p>
+            <w:pPr>
+              <w:spacing w:after="0"/>
+              <w:rPr>
+                <w:rFonts w:cs="Arial"/>
+                <w:color w:val="000000" w:themeColor="text1"/>
+              </w:rPr>
+            </w:pPr>
+            <w:r>
+              <w:rPr>
+                <w:rFonts w:cs="Arial"/>
+                <w:color w:val="000000" w:themeColor="text1"/>
+                <w:sz w:val="17"/>
+              </w:rPr>
+              <w:t xml:space="preserve">  "</w:t>
+            </w:r>
+            <w:proofErr w:type="spellStart"/>
+            <w:r>
+              <w:rPr>
+                <w:rFonts w:cs="Arial"/>
+                <w:color w:val="000000" w:themeColor="text1"/>
+                <w:sz w:val="17"/>
+              </w:rPr>
+              <w:t>cotacaoSimulada</w:t>
+            </w:r>
+            <w:proofErr w:type="spellEnd"/>
+            <w:r>
+              <w:rPr>
+                <w:rFonts w:cs="Arial"/>
+                <w:color w:val="000000" w:themeColor="text1"/>
+                <w:sz w:val="17"/>
+              </w:rPr>
+              <w:t>": true</w:t>
             </w:r>
             <w:r>
               <w:rPr>
@@ -1873,6 +2203,229 @@
         </w:tc>
       </w:tr>
     </w:tbl>
+    <w:p>
+      <w:pPr>
+        <w:spacing w:before="120" w:after="60"/>
+        <w:rPr>
+          <w:rFonts w:cs="Arial"/>
+          <w:b/>
+          <w:bCs/>
+          <w:color w:val="000000" w:themeColor="text1"/>
+          <w:lang w:val="pt-BR"/>
+        </w:rPr>
+      </w:pPr>
+    </w:p>
+    <w:p>
+      <w:pPr>
+        <w:spacing w:before="120" w:after="60"/>
+        <w:rPr>
+          <w:rFonts w:cs="Arial"/>
+          <w:color w:val="000000" w:themeColor="text1"/>
+          <w:lang w:val="pt-BR"/>
+        </w:rPr>
+      </w:pPr>
+      <w:r>
+        <w:rPr>
+          <w:rFonts w:cs="Arial"/>
+          <w:b/>
+          <w:bCs/>
+          <w:color w:val="000000" w:themeColor="text1"/>
+          <w:lang w:val="pt-BR"/>
+        </w:rPr>
+        <w:t>2.2.1 Implementação da função</w:t>
+      </w:r>
+    </w:p>
+    <w:p>
+      <w:pPr>
+        <w:spacing w:before="120" w:after="60"/>
+        <w:rPr>
+          <w:rFonts w:cs="Arial"/>
+          <w:color w:val="000000" w:themeColor="text1"/>
+          <w:lang w:val="pt-BR"/>
+        </w:rPr>
+      </w:pPr>
+      <w:r>
+        <w:rPr>
+          <w:rFonts w:cs="Arial"/>
+          <w:color w:val="000000" w:themeColor="text1"/>
+          <w:lang w:val="pt-BR"/>
+        </w:rPr>
+        <w:t xml:space="preserve">- Linguagem: </w:t>
+      </w:r>
+      <w:proofErr w:type="spellStart"/>
+      <w:r>
+        <w:rPr>
+          <w:rFonts w:cs="Arial"/>
+          <w:color w:val="000000" w:themeColor="text1"/>
+          <w:lang w:val="pt-BR"/>
+        </w:rPr>
+        <w:t>JavaScript</w:t>
+      </w:r>
+      <w:proofErr w:type="spellEnd"/>
+      <w:r>
+        <w:rPr>
+          <w:rFonts w:cs="Arial"/>
+          <w:color w:val="000000" w:themeColor="text1"/>
+          <w:lang w:val="pt-BR"/>
+        </w:rPr>
+        <w:t>.</w:t>
+      </w:r>
+    </w:p>
+    <w:p>
+      <w:pPr>
+        <w:spacing w:before="120" w:after="60"/>
+        <w:rPr>
+          <w:rFonts w:cs="Arial"/>
+          <w:color w:val="000000" w:themeColor="text1"/>
+          <w:lang w:val="pt-BR"/>
+        </w:rPr>
+      </w:pPr>
+      <w:r>
+        <w:rPr>
+          <w:rFonts w:cs="Arial"/>
+          <w:color w:val="000000" w:themeColor="text1"/>
+          <w:lang w:val="pt-BR"/>
+        </w:rPr>
+        <w:t xml:space="preserve">- </w:t>
+      </w:r>
+      <w:proofErr w:type="spellStart"/>
+      <w:r>
+        <w:rPr>
+          <w:rFonts w:cs="Arial"/>
+          <w:color w:val="000000" w:themeColor="text1"/>
+          <w:lang w:val="pt-BR"/>
+        </w:rPr>
+        <w:t>Runtime</w:t>
+      </w:r>
+      <w:proofErr w:type="spellEnd"/>
+      <w:r>
+        <w:rPr>
+          <w:rFonts w:cs="Arial"/>
+          <w:color w:val="000000" w:themeColor="text1"/>
+          <w:lang w:val="pt-BR"/>
+        </w:rPr>
+        <w:t>: Node.js, conforme a implementação desenvolvida.</w:t>
+      </w:r>
+    </w:p>
+    <w:p>
+      <w:pPr>
+        <w:spacing w:before="120" w:after="60"/>
+        <w:rPr>
+          <w:rFonts w:cs="Arial"/>
+          <w:color w:val="000000" w:themeColor="text1"/>
+          <w:lang w:val="pt-BR"/>
+        </w:rPr>
+      </w:pPr>
+      <w:r>
+        <w:rPr>
+          <w:rFonts w:cs="Arial"/>
+          <w:color w:val="000000" w:themeColor="text1"/>
+          <w:lang w:val="pt-BR"/>
+        </w:rPr>
+        <w:t xml:space="preserve">- Plataforma: Azure </w:t>
+      </w:r>
+      <w:proofErr w:type="spellStart"/>
+      <w:r>
+        <w:rPr>
+          <w:rFonts w:cs="Arial"/>
+          <w:color w:val="000000" w:themeColor="text1"/>
+          <w:lang w:val="pt-BR"/>
+        </w:rPr>
+        <w:t>Functions</w:t>
+      </w:r>
+      <w:proofErr w:type="spellEnd"/>
+      <w:r>
+        <w:rPr>
+          <w:rFonts w:cs="Arial"/>
+          <w:color w:val="000000" w:themeColor="text1"/>
+          <w:lang w:val="pt-BR"/>
+        </w:rPr>
+        <w:t>.</w:t>
+      </w:r>
+    </w:p>
+    <w:p>
+      <w:pPr>
+        <w:spacing w:before="120" w:after="60"/>
+        <w:rPr>
+          <w:rFonts w:cs="Arial"/>
+          <w:color w:val="000000" w:themeColor="text1"/>
+          <w:lang w:val="pt-BR"/>
+        </w:rPr>
+      </w:pPr>
+      <w:r>
+        <w:rPr>
+          <w:rFonts w:cs="Arial"/>
+          <w:color w:val="000000" w:themeColor="text1"/>
+          <w:lang w:val="pt-BR"/>
+        </w:rPr>
+        <w:t>- Região: North Central US (</w:t>
+      </w:r>
+      <w:proofErr w:type="spellStart"/>
+      <w:r>
+        <w:rPr>
+          <w:rFonts w:cs="Arial"/>
+          <w:color w:val="000000" w:themeColor="text1"/>
+          <w:lang w:val="pt-BR"/>
+        </w:rPr>
+        <w:t>northcentralus</w:t>
+      </w:r>
+      <w:proofErr w:type="spellEnd"/>
+      <w:r>
+        <w:rPr>
+          <w:rFonts w:cs="Arial"/>
+          <w:color w:val="000000" w:themeColor="text1"/>
+          <w:lang w:val="pt-BR"/>
+        </w:rPr>
+        <w:t>).</w:t>
+      </w:r>
+    </w:p>
+    <w:p>
+      <w:pPr>
+        <w:spacing w:before="120" w:after="60"/>
+        <w:rPr>
+          <w:rFonts w:cs="Arial"/>
+          <w:color w:val="000000" w:themeColor="text1"/>
+          <w:lang w:val="pt-BR"/>
+        </w:rPr>
+      </w:pPr>
+    </w:p>
+    <w:p>
+      <w:pPr>
+        <w:spacing w:before="120" w:after="60"/>
+        <w:rPr>
+          <w:rFonts w:cs="Arial"/>
+          <w:color w:val="000000" w:themeColor="text1"/>
+          <w:lang w:val="pt-BR"/>
+        </w:rPr>
+      </w:pPr>
+      <w:r>
+        <w:rPr>
+          <w:rFonts w:cs="Arial"/>
+          <w:b/>
+          <w:bCs/>
+          <w:color w:val="000000" w:themeColor="text1"/>
+          <w:lang w:val="pt-BR"/>
+        </w:rPr>
+        <w:t>2.2.2 Origem das cotações e tratamento de erros</w:t>
+      </w:r>
+    </w:p>
+    <w:p>
+      <w:pPr>
+        <w:spacing w:before="120" w:after="60"/>
+        <w:rPr>
+          <w:rFonts w:cs="Arial"/>
+          <w:color w:val="000000" w:themeColor="text1"/>
+        </w:rPr>
+      </w:pPr>
+      <w:r>
+        <w:rPr>
+          <w:rFonts w:cs="Arial"/>
+          <w:color w:val="000000" w:themeColor="text1"/>
+          <w:lang w:val="pt-BR"/>
+        </w:rPr>
+        <w:t>A função utiliza cotações fixas para fins de demonstração acadêmica: R$ 5,00 por dólar e R$ 6,25 por euro.</w:t>
+      </w:r>
+    </w:p>
     <w:p>
       <w:pPr>
         <w:spacing w:before="120" w:after="60"/>
@@ -2750,6 +3303,7 @@
           <w:rFonts w:cs="Arial"/>
           <w:color w:val="000000" w:themeColor="text1"/>
         </w:rPr>
+        <w:lastRenderedPageBreak/>
         <w:t>O frontend utiliza a API de temporização do navegador para medir a latência total observada. Essa medida inclui rede, processamento no provedor e transferência da resposta, portanto não equivale somente ao tempo de execução interno da função.</w:t>
       </w:r>
     </w:p>
@@ -3109,7 +3663,6 @@
                 <w:color w:val="000000" w:themeColor="text1"/>
                 <w:sz w:val="16"/>
               </w:rPr>
-              <w:lastRenderedPageBreak/>
               <w:t>Azure Functions</w:t>
             </w:r>
           </w:p>
@@ -3139,8 +3692,18 @@
                 <w:color w:val="000000" w:themeColor="text1"/>
                 <w:sz w:val="16"/>
               </w:rPr>
-              <w:t>Registrar a medição real</w:t>
+              <w:t xml:space="preserve">2.125 </w:t>
             </w:r>
+            <w:proofErr w:type="spellStart"/>
+            <w:r>
+              <w:rPr>
+                <w:rFonts w:cs="Arial"/>
+                <w:color w:val="000000" w:themeColor="text1"/>
+                <w:sz w:val="16"/>
+              </w:rPr>
+              <w:t>ms</w:t>
+            </w:r>
+            <w:proofErr w:type="spellEnd"/>
           </w:p>
         </w:tc>
         <w:tc>
@@ -3168,8 +3731,18 @@
                 <w:color w:val="000000" w:themeColor="text1"/>
                 <w:sz w:val="16"/>
               </w:rPr>
-              <w:t>Registrar a medição real</w:t>
+              <w:t xml:space="preserve">159 </w:t>
             </w:r>
+            <w:proofErr w:type="spellStart"/>
+            <w:r>
+              <w:rPr>
+                <w:rFonts w:cs="Arial"/>
+                <w:color w:val="000000" w:themeColor="text1"/>
+                <w:sz w:val="16"/>
+              </w:rPr>
+              <w:t>ms</w:t>
+            </w:r>
+            <w:proofErr w:type="spellEnd"/>
           </w:p>
         </w:tc>
         <w:tc>
@@ -3385,8 +3958,8 @@
         <w:tblLook w:val="04A0" w:firstRow="1" w:lastRow="0" w:firstColumn="1" w:lastColumn="0" w:noHBand="0" w:noVBand="1"/>
       </w:tblPr>
       <w:tblGrid>
-        <w:gridCol w:w="1800"/>
-        <w:gridCol w:w="3024"/>
+        <w:gridCol w:w="1125"/>
+        <w:gridCol w:w="3699"/>
         <w:gridCol w:w="3024"/>
         <w:gridCol w:w="2358"/>
       </w:tblGrid>
@@ -3396,7 +3969,7 @@
         </w:trPr>
         <w:tc>
           <w:tcPr>
-            <w:tcW w:w="1800" w:type="dxa"/>
+            <w:tcW w:w="1125" w:type="dxa"/>
             <w:tcBorders>
               <w:top w:val="single" w:sz="5" w:space="0" w:color="FFFFFF"/>
               <w:left w:val="single" w:sz="5" w:space="0" w:color="FFFFFF"/>
@@ -3428,7 +4001,7 @@
         </w:tc>
         <w:tc>
           <w:tcPr>
-            <w:tcW w:w="3024" w:type="dxa"/>
+            <w:tcW w:w="3699" w:type="dxa"/>
             <w:tcBorders>
               <w:top w:val="single" w:sz="5" w:space="0" w:color="FFFFFF"/>
               <w:left w:val="single" w:sz="5" w:space="0" w:color="FFFFFF"/>
@@ -3523,7 +4096,7 @@
         </w:trPr>
         <w:tc>
           <w:tcPr>
-            <w:tcW w:w="1800" w:type="dxa"/>
+            <w:tcW w:w="1125" w:type="dxa"/>
             <w:tcBorders>
               <w:top w:val="single" w:sz="4" w:space="0" w:color="CBD8E3"/>
               <w:left w:val="single" w:sz="4" w:space="0" w:color="CBD8E3"/>
@@ -3552,7 +4125,7 @@
         </w:tc>
         <w:tc>
           <w:tcPr>
-            <w:tcW w:w="3024" w:type="dxa"/>
+            <w:tcW w:w="3699" w:type="dxa"/>
             <w:tcBorders>
               <w:top w:val="single" w:sz="4" w:space="0" w:color="CBD8E3"/>
               <w:left w:val="single" w:sz="4" w:space="0" w:color="CBD8E3"/>
@@ -3604,7 +4177,223 @@
                 <w:color w:val="000000" w:themeColor="text1"/>
                 <w:sz w:val="15"/>
               </w:rPr>
-              <w:t>Definir identidade e autenticação da Function App; configurar acesso HTTP conforme a necessidade da aplicação.</w:t>
+              <w:t xml:space="preserve">A </w:t>
+            </w:r>
+            <w:proofErr w:type="spellStart"/>
+            <w:r>
+              <w:rPr>
+                <w:rFonts w:cs="Arial"/>
+                <w:color w:val="000000" w:themeColor="text1"/>
+                <w:sz w:val="15"/>
+              </w:rPr>
+              <w:t>configuração</w:t>
+            </w:r>
+            <w:proofErr w:type="spellEnd"/>
+            <w:r>
+              <w:rPr>
+                <w:rFonts w:cs="Arial"/>
+                <w:color w:val="000000" w:themeColor="text1"/>
+                <w:sz w:val="15"/>
+              </w:rPr>
+              <w:t xml:space="preserve"> </w:t>
+            </w:r>
+            <w:proofErr w:type="spellStart"/>
+            <w:r>
+              <w:rPr>
+                <w:rFonts w:cs="Arial"/>
+                <w:color w:val="000000" w:themeColor="text1"/>
+                <w:sz w:val="15"/>
+              </w:rPr>
+              <w:t>utilizada</w:t>
+            </w:r>
+            <w:proofErr w:type="spellEnd"/>
+            <w:r>
+              <w:rPr>
+                <w:rFonts w:cs="Arial"/>
+                <w:color w:val="000000" w:themeColor="text1"/>
+                <w:sz w:val="15"/>
+              </w:rPr>
+              <w:t xml:space="preserve"> no </w:t>
+            </w:r>
+            <w:proofErr w:type="spellStart"/>
+            <w:r>
+              <w:rPr>
+                <w:rFonts w:cs="Arial"/>
+                <w:color w:val="000000" w:themeColor="text1"/>
+                <w:sz w:val="15"/>
+              </w:rPr>
+              <w:t>desenvolvimento</w:t>
+            </w:r>
+            <w:proofErr w:type="spellEnd"/>
+            <w:r>
+              <w:rPr>
+                <w:rFonts w:cs="Arial"/>
+                <w:color w:val="000000" w:themeColor="text1"/>
+                <w:sz w:val="15"/>
+              </w:rPr>
+              <w:t xml:space="preserve"> </w:t>
+            </w:r>
+            <w:proofErr w:type="spellStart"/>
+            <w:r>
+              <w:rPr>
+                <w:rFonts w:cs="Arial"/>
+                <w:color w:val="000000" w:themeColor="text1"/>
+                <w:sz w:val="15"/>
+              </w:rPr>
+              <w:t>permite</w:t>
+            </w:r>
+            <w:proofErr w:type="spellEnd"/>
+            <w:r>
+              <w:rPr>
+                <w:rFonts w:cs="Arial"/>
+                <w:color w:val="000000" w:themeColor="text1"/>
+                <w:sz w:val="15"/>
+              </w:rPr>
+              <w:t xml:space="preserve"> </w:t>
+            </w:r>
+            <w:proofErr w:type="spellStart"/>
+            <w:r>
+              <w:rPr>
+                <w:rFonts w:cs="Arial"/>
+                <w:color w:val="000000" w:themeColor="text1"/>
+                <w:sz w:val="15"/>
+              </w:rPr>
+              <w:t>chamadas</w:t>
+            </w:r>
+            <w:proofErr w:type="spellEnd"/>
+            <w:r>
+              <w:rPr>
+                <w:rFonts w:cs="Arial"/>
+                <w:color w:val="000000" w:themeColor="text1"/>
+                <w:sz w:val="15"/>
+              </w:rPr>
+              <w:t xml:space="preserve"> </w:t>
+            </w:r>
+            <w:proofErr w:type="spellStart"/>
+            <w:r>
+              <w:rPr>
+                <w:rFonts w:cs="Arial"/>
+                <w:color w:val="000000" w:themeColor="text1"/>
+                <w:sz w:val="15"/>
+              </w:rPr>
+              <w:t>anônimas</w:t>
+            </w:r>
+            <w:proofErr w:type="spellEnd"/>
+            <w:r>
+              <w:rPr>
+                <w:rFonts w:cs="Arial"/>
+                <w:color w:val="000000" w:themeColor="text1"/>
+                <w:sz w:val="15"/>
+              </w:rPr>
+              <w:t xml:space="preserve">, </w:t>
+            </w:r>
+            <w:proofErr w:type="spellStart"/>
+            <w:r>
+              <w:rPr>
+                <w:rFonts w:cs="Arial"/>
+                <w:color w:val="000000" w:themeColor="text1"/>
+                <w:sz w:val="15"/>
+              </w:rPr>
+              <w:t>sem</w:t>
+            </w:r>
+            <w:proofErr w:type="spellEnd"/>
+            <w:r>
+              <w:rPr>
+                <w:rFonts w:cs="Arial"/>
+                <w:color w:val="000000" w:themeColor="text1"/>
+                <w:sz w:val="15"/>
+              </w:rPr>
+              <w:t xml:space="preserve"> </w:t>
+            </w:r>
+            <w:proofErr w:type="spellStart"/>
+            <w:r>
+              <w:rPr>
+                <w:rFonts w:cs="Arial"/>
+                <w:color w:val="000000" w:themeColor="text1"/>
+                <w:sz w:val="15"/>
+              </w:rPr>
+              <w:t>exigir</w:t>
+            </w:r>
+            <w:proofErr w:type="spellEnd"/>
+            <w:r>
+              <w:rPr>
+                <w:rFonts w:cs="Arial"/>
+                <w:color w:val="000000" w:themeColor="text1"/>
+                <w:sz w:val="15"/>
+              </w:rPr>
+              <w:t xml:space="preserve"> </w:t>
+            </w:r>
+            <w:proofErr w:type="spellStart"/>
+            <w:r>
+              <w:rPr>
+                <w:rFonts w:cs="Arial"/>
+                <w:color w:val="000000" w:themeColor="text1"/>
+                <w:sz w:val="15"/>
+              </w:rPr>
+              <w:t>uma</w:t>
+            </w:r>
+            <w:proofErr w:type="spellEnd"/>
+            <w:r>
+              <w:rPr>
+                <w:rFonts w:cs="Arial"/>
+                <w:color w:val="000000" w:themeColor="text1"/>
+                <w:sz w:val="15"/>
+              </w:rPr>
+              <w:t xml:space="preserve"> </w:t>
+            </w:r>
+            <w:proofErr w:type="spellStart"/>
+            <w:r>
+              <w:rPr>
+                <w:rFonts w:cs="Arial"/>
+                <w:color w:val="000000" w:themeColor="text1"/>
+                <w:sz w:val="15"/>
+              </w:rPr>
+              <w:t>chave</w:t>
+            </w:r>
+            <w:proofErr w:type="spellEnd"/>
+            <w:r>
+              <w:rPr>
+                <w:rFonts w:cs="Arial"/>
+                <w:color w:val="000000" w:themeColor="text1"/>
+                <w:sz w:val="15"/>
+              </w:rPr>
+              <w:t xml:space="preserve"> de </w:t>
+            </w:r>
+            <w:proofErr w:type="spellStart"/>
+            <w:r>
+              <w:rPr>
+                <w:rFonts w:cs="Arial"/>
+                <w:color w:val="000000" w:themeColor="text1"/>
+                <w:sz w:val="15"/>
+              </w:rPr>
+              <w:t>função</w:t>
+            </w:r>
+            <w:proofErr w:type="spellEnd"/>
+            <w:r>
+              <w:rPr>
+                <w:rFonts w:cs="Arial"/>
+                <w:color w:val="000000" w:themeColor="text1"/>
+                <w:sz w:val="15"/>
+              </w:rPr>
+              <w:t xml:space="preserve"> no </w:t>
+            </w:r>
+            <w:proofErr w:type="spellStart"/>
+            <w:r>
+              <w:rPr>
+                <w:rFonts w:cs="Arial"/>
+                <w:color w:val="000000" w:themeColor="text1"/>
+                <w:sz w:val="15"/>
+              </w:rPr>
+              <w:t>cliente</w:t>
+            </w:r>
+            <w:proofErr w:type="spellEnd"/>
+            <w:r>
+              <w:rPr>
+                <w:rFonts w:cs="Arial"/>
+                <w:color w:val="000000" w:themeColor="text1"/>
+                <w:sz w:val="15"/>
+              </w:rPr>
+              <w:t>.</w:t>
             </w:r>
           </w:p>
         </w:tc>
@@ -3633,7 +4422,25 @@
                 <w:color w:val="000000" w:themeColor="text1"/>
                 <w:sz w:val="15"/>
               </w:rPr>
-              <w:t>Definir identidade de execução e permissão de invocação HTTP; avaliar explicitamente a exposição pública.</w:t>
+              <w:t xml:space="preserve">Definir identidade de execução e permissão de invocação HTTP; avaliar explicitamente </w:t>
+            </w:r>
+            <w:proofErr w:type="gramStart"/>
+            <w:r>
+              <w:rPr>
+                <w:rFonts w:cs="Arial"/>
+                <w:color w:val="000000" w:themeColor="text1"/>
+                <w:sz w:val="15"/>
+              </w:rPr>
+              <w:t>a</w:t>
+            </w:r>
+            <w:proofErr w:type="gramEnd"/>
+            <w:r>
+              <w:rPr>
+                <w:rFonts w:cs="Arial"/>
+                <w:color w:val="000000" w:themeColor="text1"/>
+                <w:sz w:val="15"/>
+              </w:rPr>
+              <w:t xml:space="preserve"> exposição pública.</w:t>
             </w:r>
           </w:p>
         </w:tc>
@@ -3644,7 +4451,7 @@
         </w:trPr>
         <w:tc>
           <w:tcPr>
-            <w:tcW w:w="1800" w:type="dxa"/>
+            <w:tcW w:w="1125" w:type="dxa"/>
             <w:tcBorders>
               <w:top w:val="single" w:sz="4" w:space="0" w:color="CBD8E3"/>
               <w:left w:val="single" w:sz="4" w:space="0" w:color="CBD8E3"/>
@@ -3673,7 +4480,7 @@
         </w:tc>
         <w:tc>
           <w:tcPr>
-            <w:tcW w:w="3024" w:type="dxa"/>
+            <w:tcW w:w="3699" w:type="dxa"/>
             <w:tcBorders>
               <w:top w:val="single" w:sz="4" w:space="0" w:color="CBD8E3"/>
               <w:left w:val="single" w:sz="4" w:space="0" w:color="CBD8E3"/>
@@ -3725,7 +4532,151 @@
                 <w:color w:val="000000" w:themeColor="text1"/>
                 <w:sz w:val="15"/>
               </w:rPr>
-              <w:t>Configurar CORS na Function App e validar preflight do navegador.</w:t>
+              <w:t xml:space="preserve">A URL </w:t>
+            </w:r>
+            <w:proofErr w:type="spellStart"/>
+            <w:r>
+              <w:rPr>
+                <w:rFonts w:cs="Arial"/>
+                <w:color w:val="000000" w:themeColor="text1"/>
+                <w:sz w:val="15"/>
+              </w:rPr>
+              <w:t>pública</w:t>
+            </w:r>
+            <w:proofErr w:type="spellEnd"/>
+            <w:r>
+              <w:rPr>
+                <w:rFonts w:cs="Arial"/>
+                <w:color w:val="000000" w:themeColor="text1"/>
+                <w:sz w:val="15"/>
+              </w:rPr>
+              <w:t xml:space="preserve"> do frontend </w:t>
+            </w:r>
+            <w:proofErr w:type="spellStart"/>
+            <w:r>
+              <w:rPr>
+                <w:rFonts w:cs="Arial"/>
+                <w:color w:val="000000" w:themeColor="text1"/>
+                <w:sz w:val="15"/>
+              </w:rPr>
+              <w:t>hospedado</w:t>
+            </w:r>
+            <w:proofErr w:type="spellEnd"/>
+            <w:r>
+              <w:rPr>
+                <w:rFonts w:cs="Arial"/>
+                <w:color w:val="000000" w:themeColor="text1"/>
+                <w:sz w:val="15"/>
+              </w:rPr>
+              <w:t xml:space="preserve"> no Railway </w:t>
+            </w:r>
+            <w:proofErr w:type="spellStart"/>
+            <w:r>
+              <w:rPr>
+                <w:rFonts w:cs="Arial"/>
+                <w:color w:val="000000" w:themeColor="text1"/>
+                <w:sz w:val="15"/>
+              </w:rPr>
+              <w:t>foi</w:t>
+            </w:r>
+            <w:proofErr w:type="spellEnd"/>
+            <w:r>
+              <w:rPr>
+                <w:rFonts w:cs="Arial"/>
+                <w:color w:val="000000" w:themeColor="text1"/>
+                <w:sz w:val="15"/>
+              </w:rPr>
+              <w:t xml:space="preserve"> </w:t>
+            </w:r>
+            <w:proofErr w:type="spellStart"/>
+            <w:r>
+              <w:rPr>
+                <w:rFonts w:cs="Arial"/>
+                <w:color w:val="000000" w:themeColor="text1"/>
+                <w:sz w:val="15"/>
+              </w:rPr>
+              <w:t>configurada</w:t>
+            </w:r>
+            <w:proofErr w:type="spellEnd"/>
+            <w:r>
+              <w:rPr>
+                <w:rFonts w:cs="Arial"/>
+                <w:color w:val="000000" w:themeColor="text1"/>
+                <w:sz w:val="15"/>
+              </w:rPr>
+              <w:t xml:space="preserve"> no CORS da Azure Function para </w:t>
+            </w:r>
+            <w:proofErr w:type="spellStart"/>
+            <w:r>
+              <w:rPr>
+                <w:rFonts w:cs="Arial"/>
+                <w:color w:val="000000" w:themeColor="text1"/>
+                <w:sz w:val="15"/>
+              </w:rPr>
+              <w:t>permitir</w:t>
+            </w:r>
+            <w:proofErr w:type="spellEnd"/>
+            <w:r>
+              <w:rPr>
+                <w:rFonts w:cs="Arial"/>
+                <w:color w:val="000000" w:themeColor="text1"/>
+                <w:sz w:val="15"/>
+              </w:rPr>
+              <w:t xml:space="preserve"> as </w:t>
+            </w:r>
+            <w:proofErr w:type="spellStart"/>
+            <w:r>
+              <w:rPr>
+                <w:rFonts w:cs="Arial"/>
+                <w:color w:val="000000" w:themeColor="text1"/>
+                <w:sz w:val="15"/>
+              </w:rPr>
+              <w:t>requisições</w:t>
+            </w:r>
+            <w:proofErr w:type="spellEnd"/>
+            <w:r>
+              <w:rPr>
+                <w:rFonts w:cs="Arial"/>
+                <w:color w:val="000000" w:themeColor="text1"/>
+                <w:sz w:val="15"/>
+              </w:rPr>
+              <w:t xml:space="preserve"> </w:t>
+            </w:r>
+            <w:proofErr w:type="spellStart"/>
+            <w:r>
+              <w:rPr>
+                <w:rFonts w:cs="Arial"/>
+                <w:color w:val="000000" w:themeColor="text1"/>
+                <w:sz w:val="15"/>
+              </w:rPr>
+              <w:t>originadas</w:t>
+            </w:r>
+            <w:proofErr w:type="spellEnd"/>
+            <w:r>
+              <w:rPr>
+                <w:rFonts w:cs="Arial"/>
+                <w:color w:val="000000" w:themeColor="text1"/>
+                <w:sz w:val="15"/>
+              </w:rPr>
+              <w:t xml:space="preserve"> da </w:t>
+            </w:r>
+            <w:proofErr w:type="spellStart"/>
+            <w:r>
+              <w:rPr>
+                <w:rFonts w:cs="Arial"/>
+                <w:color w:val="000000" w:themeColor="text1"/>
+                <w:sz w:val="15"/>
+              </w:rPr>
+              <w:t>aplicação</w:t>
+            </w:r>
+            <w:proofErr w:type="spellEnd"/>
+            <w:r>
+              <w:rPr>
+                <w:rFonts w:cs="Arial"/>
+                <w:color w:val="000000" w:themeColor="text1"/>
+                <w:sz w:val="15"/>
+              </w:rPr>
+              <w:t>.</w:t>
             </w:r>
           </w:p>
         </w:tc>
@@ -3765,7 +4716,7 @@
         </w:trPr>
         <w:tc>
           <w:tcPr>
-            <w:tcW w:w="1800" w:type="dxa"/>
+            <w:tcW w:w="1125" w:type="dxa"/>
             <w:tcBorders>
               <w:top w:val="single" w:sz="4" w:space="0" w:color="CBD8E3"/>
               <w:left w:val="single" w:sz="4" w:space="0" w:color="CBD8E3"/>
@@ -3794,7 +4745,7 @@
         </w:tc>
         <w:tc>
           <w:tcPr>
-            <w:tcW w:w="3024" w:type="dxa"/>
+            <w:tcW w:w="3699" w:type="dxa"/>
             <w:tcBorders>
               <w:top w:val="single" w:sz="4" w:space="0" w:color="CBD8E3"/>
               <w:left w:val="single" w:sz="4" w:space="0" w:color="CBD8E3"/>
@@ -3843,10 +4794,54 @@
             <w:r>
               <w:rPr>
                 <w:rFonts w:cs="Arial"/>
-                <w:color w:val="000000" w:themeColor="text1"/>
-                <w:sz w:val="15"/>
-              </w:rPr>
-              <w:t>Application Insights e monitoramento da Function App para duração e exceções.</w:t>
+                <w:noProof/>
+                <w:color w:val="000000" w:themeColor="text1"/>
+              </w:rPr>
+              <w:drawing>
+                <wp:inline distT="0" distB="0" distL="0" distR="0" wp14:anchorId="65118291" wp14:editId="2564727E">
+                  <wp:extent cx="1851433" cy="866702"/>
+                  <wp:effectExtent l="0" t="0" r="0" b="0"/>
+                  <wp:docPr id="40549064" name="Imagem 2"/>
+                  <wp:cNvGraphicFramePr>
+                    <a:graphicFrameLocks xmlns:a="http://schemas.openxmlformats.org/drawingml/2006/main" noChangeAspect="1"/>
+                  </wp:cNvGraphicFramePr>
+                  <a:graphic xmlns:a="http://schemas.openxmlformats.org/drawingml/2006/main">
+                    <a:graphicData uri="http://schemas.openxmlformats.org/drawingml/2006/picture">
+                      <pic:pic xmlns:pic="http://schemas.openxmlformats.org/drawingml/2006/picture">
+                        <pic:nvPicPr>
+                          <pic:cNvPr id="0" name="Picture 2"/>
+                          <pic:cNvPicPr>
+                            <a:picLocks noChangeAspect="1" noChangeArrowheads="1"/>
+                          </pic:cNvPicPr>
+                        </pic:nvPicPr>
+                        <pic:blipFill>
+                          <a:blip r:embed="rId9">
+                            <a:extLst>
+                              <a:ext uri="{28A0092B-C50C-407E-A947-70E740481C1C}">
+                                <a14:useLocalDpi xmlns:a14="http://schemas.microsoft.com/office/drawing/2010/main" val="0"/>
+                              </a:ext>
+                            </a:extLst>
+                          </a:blip>
+                          <a:srcRect/>
+                          <a:stretch>
+                            <a:fillRect/>
+                          </a:stretch>
+                        </pic:blipFill>
+                        <pic:spPr bwMode="auto">
+                          <a:xfrm>
+                            <a:off x="0" y="0"/>
+                            <a:ext cx="1871964" cy="876313"/>
+                          </a:xfrm>
+                          <a:prstGeom prst="rect">
+                            <a:avLst/>
+                          </a:prstGeom>
+                          <a:noFill/>
+                        </pic:spPr>
+                      </pic:pic>
+                    </a:graphicData>
+                  </a:graphic>
+                </wp:inline>
+              </w:drawing>
             </w:r>
           </w:p>
         </w:tc>
@@ -3886,7 +4881,7 @@
         </w:trPr>
         <w:tc>
           <w:tcPr>
-            <w:tcW w:w="1800" w:type="dxa"/>
+            <w:tcW w:w="1125" w:type="dxa"/>
             <w:tcBorders>
               <w:top w:val="single" w:sz="4" w:space="0" w:color="CBD8E3"/>
               <w:left w:val="single" w:sz="4" w:space="0" w:color="CBD8E3"/>
@@ -3915,7 +4910,7 @@
         </w:tc>
         <w:tc>
           <w:tcPr>
-            <w:tcW w:w="3024" w:type="dxa"/>
+            <w:tcW w:w="3699" w:type="dxa"/>
             <w:tcBorders>
               <w:top w:val="single" w:sz="4" w:space="0" w:color="CBD8E3"/>
               <w:left w:val="single" w:sz="4" w:space="0" w:color="CBD8E3"/>
@@ -3959,16 +4954,71 @@
               <w:rPr>
                 <w:rFonts w:cs="Arial"/>
                 <w:color w:val="000000" w:themeColor="text1"/>
+                <w:sz w:val="15"/>
               </w:rPr>
             </w:pPr>
             <w:r>
               <w:rPr>
                 <w:rFonts w:cs="Arial"/>
+                <w:noProof/>
                 <w:color w:val="000000" w:themeColor="text1"/>
                 <w:sz w:val="15"/>
               </w:rPr>
-              <w:t>Publicar a Function App, validar runtime e rota HTTP e confirmar as configurações de CORS.</w:t>
+              <w:drawing>
+                <wp:inline distT="0" distB="0" distL="0" distR="0" wp14:anchorId="6033F435" wp14:editId="77D48B39">
+                  <wp:extent cx="1851025" cy="867668"/>
+                  <wp:effectExtent l="0" t="0" r="0" b="8890"/>
+                  <wp:docPr id="1458597034" name="Imagem 4"/>
+                  <wp:cNvGraphicFramePr>
+                    <a:graphicFrameLocks xmlns:a="http://schemas.openxmlformats.org/drawingml/2006/main" noChangeAspect="1"/>
+                  </wp:cNvGraphicFramePr>
+                  <a:graphic xmlns:a="http://schemas.openxmlformats.org/drawingml/2006/main">
+                    <a:graphicData uri="http://schemas.openxmlformats.org/drawingml/2006/picture">
+                      <pic:pic xmlns:pic="http://schemas.openxmlformats.org/drawingml/2006/picture">
+                        <pic:nvPicPr>
+                          <pic:cNvPr id="0" name="Picture 3"/>
+                          <pic:cNvPicPr>
+                            <a:picLocks noChangeAspect="1" noChangeArrowheads="1"/>
+                          </pic:cNvPicPr>
+                        </pic:nvPicPr>
+                        <pic:blipFill>
+                          <a:blip r:embed="rId10">
+                            <a:extLst>
+                              <a:ext uri="{28A0092B-C50C-407E-A947-70E740481C1C}">
+                                <a14:useLocalDpi xmlns:a14="http://schemas.microsoft.com/office/drawing/2010/main" val="0"/>
+                              </a:ext>
+                            </a:extLst>
+                          </a:blip>
+                          <a:srcRect/>
+                          <a:stretch>
+                            <a:fillRect/>
+                          </a:stretch>
+                        </pic:blipFill>
+                        <pic:spPr bwMode="auto">
+                          <a:xfrm>
+                            <a:off x="0" y="0"/>
+                            <a:ext cx="1891920" cy="886838"/>
+                          </a:xfrm>
+                          <a:prstGeom prst="rect">
+                            <a:avLst/>
+                          </a:prstGeom>
+                          <a:noFill/>
+                        </pic:spPr>
+                      </pic:pic>
+                    </a:graphicData>
+                  </a:graphic>
+                </wp:inline>
+              </w:drawing>
             </w:r>
+          </w:p>
+          <w:p>
+            <w:pPr>
+              <w:spacing w:after="0"/>
+              <w:rPr>
+                <w:rFonts w:cs="Arial"/>
+                <w:color w:val="000000" w:themeColor="text1"/>
+              </w:rPr>
+            </w:pPr>
           </w:p>
         </w:tc>
         <w:tc>
@@ -4007,7 +5057,7 @@
         </w:trPr>
         <w:tc>
           <w:tcPr>
-            <w:tcW w:w="1800" w:type="dxa"/>
+            <w:tcW w:w="1125" w:type="dxa"/>
             <w:tcBorders>
               <w:top w:val="single" w:sz="4" w:space="0" w:color="CBD8E3"/>
               <w:left w:val="single" w:sz="4" w:space="0" w:color="CBD8E3"/>
@@ -4024,19 +5074,39 @@
                 <w:color w:val="000000" w:themeColor="text1"/>
               </w:rPr>
             </w:pPr>
+            <w:proofErr w:type="spellStart"/>
             <w:r>
               <w:rPr>
                 <w:rFonts w:cs="Arial"/>
                 <w:color w:val="000000" w:themeColor="text1"/>
                 <w:sz w:val="15"/>
               </w:rPr>
-              <w:t>Validação funcional</w:t>
+              <w:t>Validação</w:t>
             </w:r>
+            <w:proofErr w:type="spellEnd"/>
+            <w:r>
+              <w:rPr>
+                <w:rFonts w:cs="Arial"/>
+                <w:color w:val="000000" w:themeColor="text1"/>
+                <w:sz w:val="15"/>
+              </w:rPr>
+              <w:t xml:space="preserve"> </w:t>
+            </w:r>
+            <w:proofErr w:type="spellStart"/>
+            <w:r>
+              <w:rPr>
+                <w:rFonts w:cs="Arial"/>
+                <w:color w:val="000000" w:themeColor="text1"/>
+                <w:sz w:val="15"/>
+              </w:rPr>
+              <w:t>funcional</w:t>
+            </w:r>
+            <w:proofErr w:type="spellEnd"/>
           </w:p>
         </w:tc>
         <w:tc>
           <w:tcPr>
-            <w:tcW w:w="3024" w:type="dxa"/>
+            <w:tcW w:w="3699" w:type="dxa"/>
             <w:tcBorders>
               <w:top w:val="single" w:sz="4" w:space="0" w:color="CBD8E3"/>
               <w:left w:val="single" w:sz="4" w:space="0" w:color="CBD8E3"/>
@@ -4085,10 +5155,54 @@
             <w:r>
               <w:rPr>
                 <w:rFonts w:cs="Arial"/>
-                <w:color w:val="000000" w:themeColor="text1"/>
-                <w:sz w:val="15"/>
-              </w:rPr>
-              <w:t>Confirmar que a resposta usa os campos esperados pela interface e testar a URL publicada.</w:t>
+                <w:noProof/>
+                <w:color w:val="000000" w:themeColor="text1"/>
+              </w:rPr>
+              <w:drawing>
+                <wp:inline distT="0" distB="0" distL="0" distR="0" wp14:anchorId="214BACA1" wp14:editId="72F51630">
+                  <wp:extent cx="1844525" cy="851940"/>
+                  <wp:effectExtent l="0" t="0" r="3810" b="5715"/>
+                  <wp:docPr id="572787147" name="Imagem 6"/>
+                  <wp:cNvGraphicFramePr>
+                    <a:graphicFrameLocks xmlns:a="http://schemas.openxmlformats.org/drawingml/2006/main" noChangeAspect="1"/>
+                  </wp:cNvGraphicFramePr>
+                  <a:graphic xmlns:a="http://schemas.openxmlformats.org/drawingml/2006/main">
+                    <a:graphicData uri="http://schemas.openxmlformats.org/drawingml/2006/picture">
+                      <pic:pic xmlns:pic="http://schemas.openxmlformats.org/drawingml/2006/picture">
+                        <pic:nvPicPr>
+                          <pic:cNvPr id="0" name="Picture 4"/>
+                          <pic:cNvPicPr>
+                            <a:picLocks noChangeAspect="1" noChangeArrowheads="1"/>
+                          </pic:cNvPicPr>
+                        </pic:nvPicPr>
+                        <pic:blipFill>
+                          <a:blip r:embed="rId11">
+                            <a:extLst>
+                              <a:ext uri="{28A0092B-C50C-407E-A947-70E740481C1C}">
+                                <a14:useLocalDpi xmlns:a14="http://schemas.microsoft.com/office/drawing/2010/main" val="0"/>
+                              </a:ext>
+                            </a:extLst>
+                          </a:blip>
+                          <a:srcRect/>
+                          <a:stretch>
+                            <a:fillRect/>
+                          </a:stretch>
+                        </pic:blipFill>
+                        <pic:spPr bwMode="auto">
+                          <a:xfrm>
+                            <a:off x="0" y="0"/>
+                            <a:ext cx="1912106" cy="883154"/>
+                          </a:xfrm>
+                          <a:prstGeom prst="rect">
+                            <a:avLst/>
+                          </a:prstGeom>
+                          <a:noFill/>
+                        </pic:spPr>
+                      </pic:pic>
+                    </a:graphicData>
+                  </a:graphic>
+                </wp:inline>
+              </w:drawing>
             </w:r>
           </w:p>
         </w:tc>
@@ -4149,7 +5263,17 @@
           <w:color w:val="000000" w:themeColor="text1"/>
           <w:sz w:val="22"/>
         </w:rPr>
-        <w:t xml:space="preserve">5.1 </w:t>
+        <w:lastRenderedPageBreak/>
+        <w:t>4</w:t>
+      </w:r>
+      <w:r>
+        <w:rPr>
+          <w:rFonts w:cs="Arial"/>
+          <w:b/>
+          <w:color w:val="000000" w:themeColor="text1"/>
+          <w:sz w:val="22"/>
+        </w:rPr>
+        <w:t xml:space="preserve">.1 </w:t>
       </w:r>
       <w:proofErr w:type="spellStart"/>
       <w:r>
@@ -4827,8 +5951,8 @@
       </w:r>
     </w:p>
     <w:sectPr>
-      <w:headerReference w:type="default" r:id="rId9"/>
-      <w:footerReference w:type="default" r:id="rId10"/>
+      <w:headerReference w:type="default" r:id="rId12"/>
+      <w:footerReference w:type="default" r:id="rId13"/>
       <w:pgSz w:w="12240" w:h="15840"/>
       <w:pgMar w:top="936" w:right="1008" w:bottom="936" w:left="1008" w:header="720" w:footer="720" w:gutter="0"/>
       <w:cols w:space="720"/>
@@ -5757,7 +6881,6 @@
   <w:style w:type="character" w:default="1" w:styleId="Fontepargpadro">
     <w:name w:val="Default Paragraph Font"/>
     <w:uiPriority w:val="1"/>
-    <w:semiHidden/>
     <w:unhideWhenUsed/>
   </w:style>
   <w:style w:type="table" w:default="1" w:styleId="Tabelanormal">

</xml_diff>

<commit_message>
add GCF in specs
</commit_message>
<xml_diff>
--- a/Documentacao_Tecnica_IHMInvest_Multicloud.docx
+++ b/Documentacao_Tecnica_IHMInvest_Multicloud.docx
@@ -715,7 +715,39 @@
           <w:rFonts w:cs="Arial"/>
           <w:color w:val="000000" w:themeColor="text1"/>
         </w:rPr>
-        <w:t xml:space="preserve">O frontend é responsável por receber os dados, validar os campos, disparar as requisições, medir a latência e consolidar as respostas. Cada provedor executa uma responsabilidade específica. O dashboard mantém os módulos independentes para que a falha de um serviço não impeça </w:t>
+        <w:t xml:space="preserve">O frontend é responsável por receber os dados, validar os campos, disparar as requisições, medir a latência e consolidar as respostas. Cada provedor executa uma responsabilidade específica. O dashboard mantém os módulos independentes para que a falha de um serviço </w:t>
+      </w:r>
+      <w:proofErr w:type="spellStart"/>
+      <w:r>
+        <w:rPr>
+          <w:rFonts w:cs="Arial"/>
+          <w:color w:val="000000" w:themeColor="text1"/>
+        </w:rPr>
+        <w:t>não</w:t>
+      </w:r>
+      <w:proofErr w:type="spellEnd"/>
+      <w:r>
+        <w:rPr>
+          <w:rFonts w:cs="Arial"/>
+          <w:color w:val="000000" w:themeColor="text1"/>
+        </w:rPr>
+        <w:t xml:space="preserve"> </w:t>
+      </w:r>
+      <w:proofErr w:type="spellStart"/>
+      <w:r>
+        <w:rPr>
+          <w:rFonts w:cs="Arial"/>
+          <w:color w:val="000000" w:themeColor="text1"/>
+        </w:rPr>
+        <w:t>impeça</w:t>
+      </w:r>
+      <w:proofErr w:type="spellEnd"/>
+      <w:r>
+        <w:rPr>
+          <w:rFonts w:cs="Arial"/>
+          <w:color w:val="000000" w:themeColor="text1"/>
+        </w:rPr>
+        <w:t xml:space="preserve"> </w:t>
       </w:r>
       <w:proofErr w:type="gramStart"/>
       <w:r>
@@ -1322,7 +1354,39 @@
           <w:rFonts w:cs="Arial"/>
           <w:color w:val="000000" w:themeColor="text1"/>
         </w:rPr>
-        <w:t xml:space="preserve">As três funções expõem endpoints HTTP do método POST e recebem dados JSON. As respostas de sucesso usam HTTP 200; entradas inválidas devem retornar HTTP 400 e falhas internas, HTTP 500. Os exemplos </w:t>
+        <w:t xml:space="preserve">As três funções expõem endpoints HTTP do método POST e recebem dados JSON. As respostas de sucesso usam HTTP 200; entradas inválidas devem retornar HTTP 400 e falhas internas, HTTP 500. </w:t>
+      </w:r>
+      <w:proofErr w:type="spellStart"/>
+      <w:r>
+        <w:rPr>
+          <w:rFonts w:cs="Arial"/>
+          <w:color w:val="000000" w:themeColor="text1"/>
+        </w:rPr>
+        <w:t>Os</w:t>
+      </w:r>
+      <w:proofErr w:type="spellEnd"/>
+      <w:r>
+        <w:rPr>
+          <w:rFonts w:cs="Arial"/>
+          <w:color w:val="000000" w:themeColor="text1"/>
+        </w:rPr>
+        <w:t xml:space="preserve"> </w:t>
+      </w:r>
+      <w:proofErr w:type="spellStart"/>
+      <w:r>
+        <w:rPr>
+          <w:rFonts w:cs="Arial"/>
+          <w:color w:val="000000" w:themeColor="text1"/>
+        </w:rPr>
+        <w:t>exemplos</w:t>
+      </w:r>
+      <w:proofErr w:type="spellEnd"/>
+      <w:r>
+        <w:rPr>
+          <w:rFonts w:cs="Arial"/>
+          <w:color w:val="000000" w:themeColor="text1"/>
+        </w:rPr>
+        <w:t xml:space="preserve"> </w:t>
       </w:r>
       <w:proofErr w:type="spellStart"/>
       <w:r>
@@ -1713,50 +1777,22 @@
         <w:t xml:space="preserve">Método: POST. </w:t>
       </w:r>
     </w:p>
-    <w:tbl>
-      <w:tblPr>
-        <w:tblW w:w="0" w:type="auto"/>
-        <w:jc w:val="center"/>
-        <w:tblLook w:val="04A0" w:firstRow="1" w:lastRow="0" w:firstColumn="1" w:lastColumn="0" w:noHBand="0" w:noVBand="1"/>
-      </w:tblPr>
-      <w:tblGrid>
-        <w:gridCol w:w="10224"/>
-      </w:tblGrid>
-      <w:tr>
-        <w:trPr>
-          <w:jc w:val="center"/>
-        </w:trPr>
-        <w:tc>
-          <w:tcPr>
-            <w:tcW w:w="10224" w:type="dxa"/>
-            <w:tcBorders>
-              <w:top w:val="single" w:sz="5" w:space="0" w:color="CBD8E3"/>
-              <w:left w:val="single" w:sz="5" w:space="0" w:color="CBD8E3"/>
-              <w:bottom w:val="single" w:sz="5" w:space="0" w:color="CBD8E3"/>
-              <w:right w:val="single" w:sz="5" w:space="0" w:color="CBD8E3"/>
-            </w:tcBorders>
-            <w:shd w:val="clear" w:color="auto" w:fill="F6F9FC"/>
-          </w:tcPr>
-          <w:p>
-            <w:pPr>
-              <w:spacing w:after="0"/>
-              <w:rPr>
-                <w:rFonts w:cs="Arial"/>
-                <w:color w:val="000000" w:themeColor="text1"/>
-              </w:rPr>
-            </w:pPr>
-            <w:r>
-              <w:rPr>
-                <w:rFonts w:cs="Arial"/>
-                <w:color w:val="000000" w:themeColor="text1"/>
-                <w:sz w:val="17"/>
-              </w:rPr>
-              <w:t>https://conversorinternacional-ckfhcba3axdjc0cw.northcentralus-01.azurewebsites.net/api/conversorInternacional</w:t>
-            </w:r>
-          </w:p>
-        </w:tc>
-      </w:tr>
-    </w:tbl>
+    <w:p>
+      <w:pPr>
+        <w:rPr>
+          <w:rFonts w:cs="Arial"/>
+          <w:color w:val="000000" w:themeColor="text1"/>
+        </w:rPr>
+      </w:pPr>
+      <w:r>
+        <w:rPr>
+          <w:rFonts w:cs="Arial"/>
+          <w:color w:val="000000" w:themeColor="text1"/>
+          <w:sz w:val="17"/>
+        </w:rPr>
+        <w:t>https://conversorinternacional-ckfhcba3axdjc0cw.northcentralus-01.azurewebsites.net/api/conversorInternacional</w:t>
+      </w:r>
+    </w:p>
     <w:p>
       <w:pPr>
         <w:rPr>
@@ -2474,8 +2510,33 @@
           <w:rFonts w:cs="Arial"/>
           <w:color w:val="000000" w:themeColor="text1"/>
         </w:rPr>
-        <w:t>Método: POST. Rota lógica: /project-inflation. A URL pública é obtida após a publicação da função.</w:t>
+        <w:t xml:space="preserve">Método: POST. </w:t>
       </w:r>
+    </w:p>
+    <w:p>
+      <w:pPr>
+        <w:rPr>
+          <w:rFonts w:cs="Arial"/>
+          <w:color w:val="000000" w:themeColor="text1"/>
+        </w:rPr>
+      </w:pPr>
+      <w:hyperlink r:id="rId9" w:history="1">
+        <w:r>
+          <w:rPr>
+            <w:rStyle w:val="Hyperlink"/>
+            <w:rFonts w:cs="Arial"/>
+          </w:rPr>
+          <w:t>https://projetor-inflacao-bnizxb6syq-rj.a.run.app</w:t>
+        </w:r>
+      </w:hyperlink>
+    </w:p>
+    <w:p>
+      <w:pPr>
+        <w:rPr>
+          <w:rFonts w:cs="Arial"/>
+          <w:color w:val="000000" w:themeColor="text1"/>
+        </w:rPr>
+      </w:pPr>
     </w:p>
     <w:p>
       <w:pPr>
@@ -3227,6 +3288,7 @@
                 <w:color w:val="000000" w:themeColor="text1"/>
                 <w:sz w:val="16"/>
               </w:rPr>
+              <w:lastRenderedPageBreak/>
               <w:t>Tempo limite</w:t>
             </w:r>
           </w:p>
@@ -3303,7 +3365,6 @@
           <w:rFonts w:cs="Arial"/>
           <w:color w:val="000000" w:themeColor="text1"/>
         </w:rPr>
-        <w:lastRenderedPageBreak/>
         <w:t>O frontend utiliza a API de temporização do navegador para medir a latência total observada. Essa medida inclui rede, processamento no provedor e transferência da resposta, portanto não equivale somente ao tempo de execução interno da função.</w:t>
       </w:r>
     </w:p>
@@ -3383,18 +3444,18 @@
         <w:tblLook w:val="04A0" w:firstRow="1" w:lastRow="0" w:firstColumn="1" w:lastColumn="0" w:noHBand="0" w:noVBand="1"/>
       </w:tblPr>
       <w:tblGrid>
-        <w:gridCol w:w="2304"/>
-        <w:gridCol w:w="2376"/>
-        <w:gridCol w:w="2448"/>
-        <w:gridCol w:w="2808"/>
+        <w:gridCol w:w="3297"/>
+        <w:gridCol w:w="3399"/>
+        <w:gridCol w:w="3502"/>
       </w:tblGrid>
       <w:tr>
         <w:trPr>
+          <w:trHeight w:val="371"/>
           <w:jc w:val="center"/>
         </w:trPr>
         <w:tc>
           <w:tcPr>
-            <w:tcW w:w="2304" w:type="dxa"/>
+            <w:tcW w:w="3297" w:type="dxa"/>
             <w:tcBorders>
               <w:top w:val="single" w:sz="5" w:space="0" w:color="FFFFFF"/>
               <w:left w:val="single" w:sz="5" w:space="0" w:color="FFFFFF"/>
@@ -3411,6 +3472,7 @@
                 <w:color w:val="FFFFFF" w:themeColor="background1"/>
               </w:rPr>
             </w:pPr>
+            <w:proofErr w:type="spellStart"/>
             <w:r>
               <w:rPr>
                 <w:rFonts w:cs="Arial"/>
@@ -3420,11 +3482,12 @@
               </w:rPr>
               <w:t>Provedor</w:t>
             </w:r>
+            <w:proofErr w:type="spellEnd"/>
           </w:p>
         </w:tc>
         <w:tc>
           <w:tcPr>
-            <w:tcW w:w="2376" w:type="dxa"/>
+            <w:tcW w:w="3399" w:type="dxa"/>
             <w:tcBorders>
               <w:top w:val="single" w:sz="5" w:space="0" w:color="FFFFFF"/>
               <w:left w:val="single" w:sz="5" w:space="0" w:color="FFFFFF"/>
@@ -3454,7 +3517,7 @@
         </w:tc>
         <w:tc>
           <w:tcPr>
-            <w:tcW w:w="2448" w:type="dxa"/>
+            <w:tcW w:w="3502" w:type="dxa"/>
             <w:tcBorders>
               <w:top w:val="single" w:sz="5" w:space="0" w:color="FFFFFF"/>
               <w:left w:val="single" w:sz="5" w:space="0" w:color="FFFFFF"/>
@@ -3482,44 +3545,15 @@
             </w:r>
           </w:p>
         </w:tc>
-        <w:tc>
-          <w:tcPr>
-            <w:tcW w:w="2808" w:type="dxa"/>
-            <w:tcBorders>
-              <w:top w:val="single" w:sz="5" w:space="0" w:color="FFFFFF"/>
-              <w:left w:val="single" w:sz="5" w:space="0" w:color="FFFFFF"/>
-              <w:bottom w:val="single" w:sz="5" w:space="0" w:color="FFFFFF"/>
-              <w:right w:val="single" w:sz="5" w:space="0" w:color="FFFFFF"/>
-            </w:tcBorders>
-            <w:shd w:val="clear" w:color="auto" w:fill="16324F"/>
-          </w:tcPr>
-          <w:p>
-            <w:pPr>
-              <w:spacing w:after="0"/>
-              <w:rPr>
-                <w:rFonts w:cs="Arial"/>
-                <w:color w:val="FFFFFF" w:themeColor="background1"/>
-              </w:rPr>
-            </w:pPr>
-            <w:r>
-              <w:rPr>
-                <w:rFonts w:cs="Arial"/>
-                <w:b/>
-                <w:color w:val="FFFFFF" w:themeColor="background1"/>
-                <w:sz w:val="16"/>
-              </w:rPr>
-              <w:t>Critério de análise</w:t>
-            </w:r>
-          </w:p>
-        </w:tc>
       </w:tr>
       <w:tr>
         <w:trPr>
+          <w:trHeight w:val="356"/>
           <w:jc w:val="center"/>
         </w:trPr>
         <w:tc>
           <w:tcPr>
-            <w:tcW w:w="2304" w:type="dxa"/>
+            <w:tcW w:w="3297" w:type="dxa"/>
             <w:tcBorders>
               <w:top w:val="single" w:sz="4" w:space="0" w:color="CBD8E3"/>
               <w:left w:val="single" w:sz="4" w:space="0" w:color="CBD8E3"/>
@@ -3548,7 +3582,7 @@
         </w:tc>
         <w:tc>
           <w:tcPr>
-            <w:tcW w:w="2376" w:type="dxa"/>
+            <w:tcW w:w="3399" w:type="dxa"/>
             <w:tcBorders>
               <w:top w:val="single" w:sz="4" w:space="0" w:color="CBD8E3"/>
               <w:left w:val="single" w:sz="4" w:space="0" w:color="CBD8E3"/>
@@ -3577,7 +3611,7 @@
         </w:tc>
         <w:tc>
           <w:tcPr>
-            <w:tcW w:w="2448" w:type="dxa"/>
+            <w:tcW w:w="3502" w:type="dxa"/>
             <w:tcBorders>
               <w:top w:val="single" w:sz="4" w:space="0" w:color="CBD8E3"/>
               <w:left w:val="single" w:sz="4" w:space="0" w:color="CBD8E3"/>
@@ -3604,9 +3638,128 @@
             </w:r>
           </w:p>
         </w:tc>
+      </w:tr>
+      <w:tr>
+        <w:trPr>
+          <w:trHeight w:val="371"/>
+          <w:jc w:val="center"/>
+        </w:trPr>
         <w:tc>
           <w:tcPr>
-            <w:tcW w:w="2808" w:type="dxa"/>
+            <w:tcW w:w="3297" w:type="dxa"/>
+            <w:tcBorders>
+              <w:top w:val="single" w:sz="4" w:space="0" w:color="CBD8E3"/>
+              <w:left w:val="single" w:sz="4" w:space="0" w:color="CBD8E3"/>
+              <w:bottom w:val="single" w:sz="4" w:space="0" w:color="CBD8E3"/>
+              <w:right w:val="single" w:sz="4" w:space="0" w:color="CBD8E3"/>
+            </w:tcBorders>
+            <w:shd w:val="clear" w:color="auto" w:fill="F6F9FC"/>
+          </w:tcPr>
+          <w:p>
+            <w:pPr>
+              <w:spacing w:after="0"/>
+              <w:rPr>
+                <w:rFonts w:cs="Arial"/>
+                <w:color w:val="000000" w:themeColor="text1"/>
+              </w:rPr>
+            </w:pPr>
+            <w:r>
+              <w:rPr>
+                <w:rFonts w:cs="Arial"/>
+                <w:color w:val="000000" w:themeColor="text1"/>
+                <w:sz w:val="16"/>
+              </w:rPr>
+              <w:t>Azure Functions</w:t>
+            </w:r>
+          </w:p>
+        </w:tc>
+        <w:tc>
+          <w:tcPr>
+            <w:tcW w:w="3399" w:type="dxa"/>
+            <w:tcBorders>
+              <w:top w:val="single" w:sz="4" w:space="0" w:color="CBD8E3"/>
+              <w:left w:val="single" w:sz="4" w:space="0" w:color="CBD8E3"/>
+              <w:bottom w:val="single" w:sz="4" w:space="0" w:color="CBD8E3"/>
+              <w:right w:val="single" w:sz="4" w:space="0" w:color="CBD8E3"/>
+            </w:tcBorders>
+            <w:shd w:val="clear" w:color="auto" w:fill="F6F9FC"/>
+          </w:tcPr>
+          <w:p>
+            <w:pPr>
+              <w:spacing w:after="0"/>
+              <w:rPr>
+                <w:rFonts w:cs="Arial"/>
+                <w:color w:val="000000" w:themeColor="text1"/>
+              </w:rPr>
+            </w:pPr>
+            <w:r>
+              <w:rPr>
+                <w:rFonts w:cs="Arial"/>
+                <w:color w:val="000000" w:themeColor="text1"/>
+                <w:sz w:val="16"/>
+              </w:rPr>
+              <w:t xml:space="preserve">2.125 </w:t>
+            </w:r>
+            <w:proofErr w:type="spellStart"/>
+            <w:r>
+              <w:rPr>
+                <w:rFonts w:cs="Arial"/>
+                <w:color w:val="000000" w:themeColor="text1"/>
+                <w:sz w:val="16"/>
+              </w:rPr>
+              <w:t>ms</w:t>
+            </w:r>
+            <w:proofErr w:type="spellEnd"/>
+          </w:p>
+        </w:tc>
+        <w:tc>
+          <w:tcPr>
+            <w:tcW w:w="3502" w:type="dxa"/>
+            <w:tcBorders>
+              <w:top w:val="single" w:sz="4" w:space="0" w:color="CBD8E3"/>
+              <w:left w:val="single" w:sz="4" w:space="0" w:color="CBD8E3"/>
+              <w:bottom w:val="single" w:sz="4" w:space="0" w:color="CBD8E3"/>
+              <w:right w:val="single" w:sz="4" w:space="0" w:color="CBD8E3"/>
+            </w:tcBorders>
+            <w:shd w:val="clear" w:color="auto" w:fill="F6F9FC"/>
+          </w:tcPr>
+          <w:p>
+            <w:pPr>
+              <w:spacing w:after="0"/>
+              <w:rPr>
+                <w:rFonts w:cs="Arial"/>
+                <w:color w:val="000000" w:themeColor="text1"/>
+              </w:rPr>
+            </w:pPr>
+            <w:r>
+              <w:rPr>
+                <w:rFonts w:cs="Arial"/>
+                <w:color w:val="000000" w:themeColor="text1"/>
+                <w:sz w:val="16"/>
+              </w:rPr>
+              <w:t xml:space="preserve">159 </w:t>
+            </w:r>
+            <w:proofErr w:type="spellStart"/>
+            <w:r>
+              <w:rPr>
+                <w:rFonts w:cs="Arial"/>
+                <w:color w:val="000000" w:themeColor="text1"/>
+                <w:sz w:val="16"/>
+              </w:rPr>
+              <w:t>ms</w:t>
+            </w:r>
+            <w:proofErr w:type="spellEnd"/>
+          </w:p>
+        </w:tc>
+      </w:tr>
+      <w:tr>
+        <w:trPr>
+          <w:trHeight w:val="385"/>
+          <w:jc w:val="center"/>
+        </w:trPr>
+        <w:tc>
+          <w:tcPr>
+            <w:tcW w:w="3297" w:type="dxa"/>
             <w:tcBorders>
               <w:top w:val="single" w:sz="4" w:space="0" w:color="CBD8E3"/>
               <w:left w:val="single" w:sz="4" w:space="0" w:color="CBD8E3"/>
@@ -3629,159 +3782,13 @@
                 <w:color w:val="000000" w:themeColor="text1"/>
                 <w:sz w:val="16"/>
               </w:rPr>
-              <w:t>Comparar primeira chamada e chamadas subsequentes.</w:t>
-            </w:r>
-          </w:p>
-        </w:tc>
-      </w:tr>
-      <w:tr>
-        <w:trPr>
-          <w:jc w:val="center"/>
-        </w:trPr>
-        <w:tc>
-          <w:tcPr>
-            <w:tcW w:w="2304" w:type="dxa"/>
-            <w:tcBorders>
-              <w:top w:val="single" w:sz="4" w:space="0" w:color="CBD8E3"/>
-              <w:left w:val="single" w:sz="4" w:space="0" w:color="CBD8E3"/>
-              <w:bottom w:val="single" w:sz="4" w:space="0" w:color="CBD8E3"/>
-              <w:right w:val="single" w:sz="4" w:space="0" w:color="CBD8E3"/>
-            </w:tcBorders>
-            <w:shd w:val="clear" w:color="auto" w:fill="F6F9FC"/>
-          </w:tcPr>
-          <w:p>
-            <w:pPr>
-              <w:spacing w:after="0"/>
-              <w:rPr>
-                <w:rFonts w:cs="Arial"/>
-                <w:color w:val="000000" w:themeColor="text1"/>
-              </w:rPr>
-            </w:pPr>
-            <w:r>
-              <w:rPr>
-                <w:rFonts w:cs="Arial"/>
-                <w:color w:val="000000" w:themeColor="text1"/>
-                <w:sz w:val="16"/>
-              </w:rPr>
-              <w:t>Azure Functions</w:t>
+              <w:t>Google Cloud Functions</w:t>
             </w:r>
           </w:p>
         </w:tc>
         <w:tc>
           <w:tcPr>
-            <w:tcW w:w="2376" w:type="dxa"/>
-            <w:tcBorders>
-              <w:top w:val="single" w:sz="4" w:space="0" w:color="CBD8E3"/>
-              <w:left w:val="single" w:sz="4" w:space="0" w:color="CBD8E3"/>
-              <w:bottom w:val="single" w:sz="4" w:space="0" w:color="CBD8E3"/>
-              <w:right w:val="single" w:sz="4" w:space="0" w:color="CBD8E3"/>
-            </w:tcBorders>
-            <w:shd w:val="clear" w:color="auto" w:fill="F6F9FC"/>
-          </w:tcPr>
-          <w:p>
-            <w:pPr>
-              <w:spacing w:after="0"/>
-              <w:rPr>
-                <w:rFonts w:cs="Arial"/>
-                <w:color w:val="000000" w:themeColor="text1"/>
-              </w:rPr>
-            </w:pPr>
-            <w:r>
-              <w:rPr>
-                <w:rFonts w:cs="Arial"/>
-                <w:color w:val="000000" w:themeColor="text1"/>
-                <w:sz w:val="16"/>
-              </w:rPr>
-              <w:t xml:space="preserve">2.125 </w:t>
-            </w:r>
-            <w:proofErr w:type="spellStart"/>
-            <w:r>
-              <w:rPr>
-                <w:rFonts w:cs="Arial"/>
-                <w:color w:val="000000" w:themeColor="text1"/>
-                <w:sz w:val="16"/>
-              </w:rPr>
-              <w:t>ms</w:t>
-            </w:r>
-            <w:proofErr w:type="spellEnd"/>
-          </w:p>
-        </w:tc>
-        <w:tc>
-          <w:tcPr>
-            <w:tcW w:w="2448" w:type="dxa"/>
-            <w:tcBorders>
-              <w:top w:val="single" w:sz="4" w:space="0" w:color="CBD8E3"/>
-              <w:left w:val="single" w:sz="4" w:space="0" w:color="CBD8E3"/>
-              <w:bottom w:val="single" w:sz="4" w:space="0" w:color="CBD8E3"/>
-              <w:right w:val="single" w:sz="4" w:space="0" w:color="CBD8E3"/>
-            </w:tcBorders>
-            <w:shd w:val="clear" w:color="auto" w:fill="F6F9FC"/>
-          </w:tcPr>
-          <w:p>
-            <w:pPr>
-              <w:spacing w:after="0"/>
-              <w:rPr>
-                <w:rFonts w:cs="Arial"/>
-                <w:color w:val="000000" w:themeColor="text1"/>
-              </w:rPr>
-            </w:pPr>
-            <w:r>
-              <w:rPr>
-                <w:rFonts w:cs="Arial"/>
-                <w:color w:val="000000" w:themeColor="text1"/>
-                <w:sz w:val="16"/>
-              </w:rPr>
-              <w:t xml:space="preserve">159 </w:t>
-            </w:r>
-            <w:proofErr w:type="spellStart"/>
-            <w:r>
-              <w:rPr>
-                <w:rFonts w:cs="Arial"/>
-                <w:color w:val="000000" w:themeColor="text1"/>
-                <w:sz w:val="16"/>
-              </w:rPr>
-              <w:t>ms</w:t>
-            </w:r>
-            <w:proofErr w:type="spellEnd"/>
-          </w:p>
-        </w:tc>
-        <w:tc>
-          <w:tcPr>
-            <w:tcW w:w="2808" w:type="dxa"/>
-            <w:tcBorders>
-              <w:top w:val="single" w:sz="4" w:space="0" w:color="CBD8E3"/>
-              <w:left w:val="single" w:sz="4" w:space="0" w:color="CBD8E3"/>
-              <w:bottom w:val="single" w:sz="4" w:space="0" w:color="CBD8E3"/>
-              <w:right w:val="single" w:sz="4" w:space="0" w:color="CBD8E3"/>
-            </w:tcBorders>
-            <w:shd w:val="clear" w:color="auto" w:fill="F6F9FC"/>
-          </w:tcPr>
-          <w:p>
-            <w:pPr>
-              <w:spacing w:after="0"/>
-              <w:rPr>
-                <w:rFonts w:cs="Arial"/>
-                <w:color w:val="000000" w:themeColor="text1"/>
-              </w:rPr>
-            </w:pPr>
-            <w:r>
-              <w:rPr>
-                <w:rFonts w:cs="Arial"/>
-                <w:color w:val="000000" w:themeColor="text1"/>
-                <w:sz w:val="16"/>
-              </w:rPr>
-              <w:t>Verificar o comportamento após inatividade e em sequência.</w:t>
-            </w:r>
-          </w:p>
-        </w:tc>
-      </w:tr>
-      <w:tr>
-        <w:trPr>
-          <w:jc w:val="center"/>
-        </w:trPr>
-        <w:tc>
-          <w:tcPr>
-            <w:tcW w:w="2304" w:type="dxa"/>
+            <w:tcW w:w="3399" w:type="dxa"/>
             <w:tcBorders>
               <w:top w:val="single" w:sz="4" w:space="0" w:color="CBD8E3"/>
               <w:left w:val="single" w:sz="4" w:space="0" w:color="CBD8E3"/>
@@ -3804,13 +3811,23 @@
                 <w:color w:val="000000" w:themeColor="text1"/>
                 <w:sz w:val="16"/>
               </w:rPr>
-              <w:t>Google Cloud Functions</w:t>
+              <w:t xml:space="preserve">181 </w:t>
             </w:r>
+            <w:proofErr w:type="spellStart"/>
+            <w:r>
+              <w:rPr>
+                <w:rFonts w:cs="Arial"/>
+                <w:color w:val="000000" w:themeColor="text1"/>
+                <w:sz w:val="16"/>
+              </w:rPr>
+              <w:t>ms</w:t>
+            </w:r>
+            <w:proofErr w:type="spellEnd"/>
           </w:p>
         </w:tc>
         <w:tc>
           <w:tcPr>
-            <w:tcW w:w="2376" w:type="dxa"/>
+            <w:tcW w:w="3502" w:type="dxa"/>
             <w:tcBorders>
               <w:top w:val="single" w:sz="4" w:space="0" w:color="CBD8E3"/>
               <w:left w:val="single" w:sz="4" w:space="0" w:color="CBD8E3"/>
@@ -3833,66 +3850,18 @@
                 <w:color w:val="000000" w:themeColor="text1"/>
                 <w:sz w:val="16"/>
               </w:rPr>
-              <w:t>Registrar a medição real</w:t>
+              <w:t xml:space="preserve">24 </w:t>
             </w:r>
-          </w:p>
-        </w:tc>
-        <w:tc>
-          <w:tcPr>
-            <w:tcW w:w="2448" w:type="dxa"/>
-            <w:tcBorders>
-              <w:top w:val="single" w:sz="4" w:space="0" w:color="CBD8E3"/>
-              <w:left w:val="single" w:sz="4" w:space="0" w:color="CBD8E3"/>
-              <w:bottom w:val="single" w:sz="4" w:space="0" w:color="CBD8E3"/>
-              <w:right w:val="single" w:sz="4" w:space="0" w:color="CBD8E3"/>
-            </w:tcBorders>
-            <w:shd w:val="clear" w:color="auto" w:fill="FFFFFF"/>
-          </w:tcPr>
-          <w:p>
-            <w:pPr>
-              <w:spacing w:after="0"/>
-              <w:rPr>
-                <w:rFonts w:cs="Arial"/>
-                <w:color w:val="000000" w:themeColor="text1"/>
-              </w:rPr>
-            </w:pPr>
+            <w:proofErr w:type="spellStart"/>
             <w:r>
               <w:rPr>
                 <w:rFonts w:cs="Arial"/>
                 <w:color w:val="000000" w:themeColor="text1"/>
                 <w:sz w:val="16"/>
               </w:rPr>
-              <w:t>Registrar a medição real</w:t>
+              <w:t>ms</w:t>
             </w:r>
-          </w:p>
-        </w:tc>
-        <w:tc>
-          <w:tcPr>
-            <w:tcW w:w="2808" w:type="dxa"/>
-            <w:tcBorders>
-              <w:top w:val="single" w:sz="4" w:space="0" w:color="CBD8E3"/>
-              <w:left w:val="single" w:sz="4" w:space="0" w:color="CBD8E3"/>
-              <w:bottom w:val="single" w:sz="4" w:space="0" w:color="CBD8E3"/>
-              <w:right w:val="single" w:sz="4" w:space="0" w:color="CBD8E3"/>
-            </w:tcBorders>
-            <w:shd w:val="clear" w:color="auto" w:fill="FFFFFF"/>
-          </w:tcPr>
-          <w:p>
-            <w:pPr>
-              <w:spacing w:after="0"/>
-              <w:rPr>
-                <w:rFonts w:cs="Arial"/>
-                <w:color w:val="000000" w:themeColor="text1"/>
-              </w:rPr>
-            </w:pPr>
-            <w:r>
-              <w:rPr>
-                <w:rFonts w:cs="Arial"/>
-                <w:color w:val="000000" w:themeColor="text1"/>
-                <w:sz w:val="16"/>
-              </w:rPr>
-              <w:t>Comparar primeira chamada e chamadas subsequentes.</w:t>
-            </w:r>
+            <w:proofErr w:type="spellEnd"/>
           </w:p>
         </w:tc>
       </w:tr>
@@ -4815,7 +4784,7 @@
                           </pic:cNvPicPr>
                         </pic:nvPicPr>
                         <pic:blipFill>
-                          <a:blip r:embed="rId9">
+                          <a:blip r:embed="rId10">
                             <a:extLst>
                               <a:ext uri="{28A0092B-C50C-407E-A947-70E740481C1C}">
                                 <a14:useLocalDpi xmlns:a14="http://schemas.microsoft.com/office/drawing/2010/main" val="0"/>
@@ -4982,7 +4951,7 @@
                           </pic:cNvPicPr>
                         </pic:nvPicPr>
                         <pic:blipFill>
-                          <a:blip r:embed="rId10">
+                          <a:blip r:embed="rId11">
                             <a:extLst>
                               <a:ext uri="{28A0092B-C50C-407E-A947-70E740481C1C}">
                                 <a14:useLocalDpi xmlns:a14="http://schemas.microsoft.com/office/drawing/2010/main" val="0"/>
@@ -5081,6 +5050,7 @@
                 <w:color w:val="000000" w:themeColor="text1"/>
                 <w:sz w:val="15"/>
               </w:rPr>
+              <w:lastRenderedPageBreak/>
               <w:t>Validação</w:t>
             </w:r>
             <w:proofErr w:type="spellEnd"/>
@@ -5176,7 +5146,7 @@
                           </pic:cNvPicPr>
                         </pic:nvPicPr>
                         <pic:blipFill>
-                          <a:blip r:embed="rId11">
+                          <a:blip r:embed="rId12">
                             <a:extLst>
                               <a:ext uri="{28A0092B-C50C-407E-A947-70E740481C1C}">
                                 <a14:useLocalDpi xmlns:a14="http://schemas.microsoft.com/office/drawing/2010/main" val="0"/>
@@ -5263,7 +5233,6 @@
           <w:color w:val="000000" w:themeColor="text1"/>
           <w:sz w:val="22"/>
         </w:rPr>
-        <w:lastRenderedPageBreak/>
         <w:t>4</w:t>
       </w:r>
       <w:r>
@@ -5403,7 +5372,16 @@
           <w:sz w:val="28"/>
         </w:rPr>
         <w:lastRenderedPageBreak/>
-        <w:t>6. Resiliência e tratamento de falhas</w:t>
+        <w:t>5</w:t>
+      </w:r>
+      <w:r>
+        <w:rPr>
+          <w:rFonts w:cs="Arial"/>
+          <w:b/>
+          <w:color w:val="000000" w:themeColor="text1"/>
+          <w:sz w:val="28"/>
+        </w:rPr>
+        <w:t>. Resiliência e tratamento de falhas</w:t>
       </w:r>
     </w:p>
     <w:p>
@@ -5839,7 +5817,16 @@
           <w:color w:val="000000" w:themeColor="text1"/>
           <w:sz w:val="28"/>
         </w:rPr>
-        <w:t>7. Segurança, observabilidade e custos</w:t>
+        <w:t>6.</w:t>
+      </w:r>
+      <w:r>
+        <w:rPr>
+          <w:rFonts w:cs="Arial"/>
+          <w:b/>
+          <w:color w:val="000000" w:themeColor="text1"/>
+          <w:sz w:val="28"/>
+        </w:rPr>
+        <w:t xml:space="preserve"> Segurança, observabilidade e custos</w:t>
       </w:r>
     </w:p>
     <w:p>
@@ -5951,8 +5938,8 @@
       </w:r>
     </w:p>
     <w:sectPr>
-      <w:headerReference w:type="default" r:id="rId12"/>
-      <w:footerReference w:type="default" r:id="rId13"/>
+      <w:headerReference w:type="default" r:id="rId13"/>
+      <w:footerReference w:type="default" r:id="rId14"/>
       <w:pgSz w:w="12240" w:h="15840"/>
       <w:pgMar w:top="936" w:right="1008" w:bottom="936" w:left="1008" w:header="720" w:footer="720" w:gutter="0"/>
       <w:cols w:space="720"/>
@@ -6881,6 +6868,7 @@
   <w:style w:type="character" w:default="1" w:styleId="Fontepargpadro">
     <w:name w:val="Default Paragraph Font"/>
     <w:uiPriority w:val="1"/>
+    <w:semiHidden/>
     <w:unhideWhenUsed/>
   </w:style>
   <w:style w:type="table" w:default="1" w:styleId="Tabelanormal">

</xml_diff>

<commit_message>
Adicionado prints da API do Google Cloud na documentação
</commit_message>
<xml_diff>
--- a/Documentacao_Tecnica_IHMInvest_Multicloud.docx
+++ b/Documentacao_Tecnica_IHMInvest_Multicloud.docx
@@ -715,7 +715,23 @@
           <w:rFonts w:cs="Arial"/>
           <w:color w:val="000000" w:themeColor="text1"/>
         </w:rPr>
-        <w:t xml:space="preserve">O frontend é responsável por receber os dados, validar os campos, disparar as requisições, medir a latência e consolidar as respostas. Cada provedor executa uma responsabilidade específica. O dashboard mantém os módulos independentes para que a falha de um serviço </w:t>
+        <w:t xml:space="preserve">O frontend é responsável por receber os dados, validar os campos, disparar as requisições, medir a latência e consolidar as respostas. Cada provedor executa uma responsabilidade específica. O dashboard mantém os módulos independentes para que a falha de um </w:t>
+      </w:r>
+      <w:proofErr w:type="spellStart"/>
+      <w:r>
+        <w:rPr>
+          <w:rFonts w:cs="Arial"/>
+          <w:color w:val="000000" w:themeColor="text1"/>
+        </w:rPr>
+        <w:t>serviço</w:t>
+      </w:r>
+      <w:proofErr w:type="spellEnd"/>
+      <w:r>
+        <w:rPr>
+          <w:rFonts w:cs="Arial"/>
+          <w:color w:val="000000" w:themeColor="text1"/>
+        </w:rPr>
+        <w:t xml:space="preserve"> </w:t>
       </w:r>
       <w:proofErr w:type="spellStart"/>
       <w:r>
@@ -2600,6 +2616,13 @@
                 <w:sz w:val="17"/>
               </w:rPr>
               <w:br/>
+            </w:r>
+            <w:r>
+              <w:rPr>
+                <w:rFonts w:cs="Arial"/>
+                <w:color w:val="000000" w:themeColor="text1"/>
+                <w:sz w:val="17"/>
+              </w:rPr>
               <w:t xml:space="preserve">  "balance": 50000.00,</w:t>
             </w:r>
             <w:r>
@@ -4737,7 +4760,61 @@
                 <w:color w:val="000000" w:themeColor="text1"/>
                 <w:sz w:val="15"/>
               </w:rPr>
-              <w:t>CloudWatch Logs e métricas de duração, invocações e erros.</w:t>
+              <w:t xml:space="preserve">CloudWatch Logs e métricas de </w:t>
+            </w:r>
+            <w:proofErr w:type="spellStart"/>
+            <w:r>
+              <w:rPr>
+                <w:rFonts w:cs="Arial"/>
+                <w:color w:val="000000" w:themeColor="text1"/>
+                <w:sz w:val="15"/>
+              </w:rPr>
+              <w:t>duração</w:t>
+            </w:r>
+            <w:proofErr w:type="spellEnd"/>
+            <w:r>
+              <w:rPr>
+                <w:rFonts w:cs="Arial"/>
+                <w:color w:val="000000" w:themeColor="text1"/>
+                <w:sz w:val="15"/>
+              </w:rPr>
+              <w:t xml:space="preserve">, </w:t>
+            </w:r>
+            <w:proofErr w:type="spellStart"/>
+            <w:r>
+              <w:rPr>
+                <w:rFonts w:cs="Arial"/>
+                <w:color w:val="000000" w:themeColor="text1"/>
+                <w:sz w:val="15"/>
+              </w:rPr>
+              <w:t>invocações</w:t>
+            </w:r>
+            <w:proofErr w:type="spellEnd"/>
+            <w:r>
+              <w:rPr>
+                <w:rFonts w:cs="Arial"/>
+                <w:color w:val="000000" w:themeColor="text1"/>
+                <w:sz w:val="15"/>
+              </w:rPr>
+              <w:t xml:space="preserve"> e </w:t>
+            </w:r>
+            <w:proofErr w:type="spellStart"/>
+            <w:r>
+              <w:rPr>
+                <w:rFonts w:cs="Arial"/>
+                <w:color w:val="000000" w:themeColor="text1"/>
+                <w:sz w:val="15"/>
+              </w:rPr>
+              <w:t>erros</w:t>
+            </w:r>
+            <w:proofErr w:type="spellEnd"/>
+            <w:r>
+              <w:rPr>
+                <w:rFonts w:cs="Arial"/>
+                <w:color w:val="000000" w:themeColor="text1"/>
+                <w:sz w:val="15"/>
+              </w:rPr>
+              <w:t>.</w:t>
             </w:r>
           </w:p>
         </w:tc>
@@ -4831,6 +4908,7 @@
               <w:rPr>
                 <w:rFonts w:cs="Arial"/>
                 <w:color w:val="000000" w:themeColor="text1"/>
+                <w:sz w:val="15"/>
               </w:rPr>
             </w:pPr>
             <w:r>
@@ -4839,7 +4917,108 @@
                 <w:color w:val="000000" w:themeColor="text1"/>
                 <w:sz w:val="15"/>
               </w:rPr>
-              <w:t>Cloud Logging e métricas de execução, duração e erros.</w:t>
+              <w:t xml:space="preserve">Cloud Logging e métricas de </w:t>
+            </w:r>
+            <w:proofErr w:type="spellStart"/>
+            <w:r>
+              <w:rPr>
+                <w:rFonts w:cs="Arial"/>
+                <w:color w:val="000000" w:themeColor="text1"/>
+                <w:sz w:val="15"/>
+              </w:rPr>
+              <w:t>execução</w:t>
+            </w:r>
+            <w:proofErr w:type="spellEnd"/>
+            <w:r>
+              <w:rPr>
+                <w:rFonts w:cs="Arial"/>
+                <w:color w:val="000000" w:themeColor="text1"/>
+                <w:sz w:val="15"/>
+              </w:rPr>
+              <w:t xml:space="preserve">, </w:t>
+            </w:r>
+            <w:proofErr w:type="spellStart"/>
+            <w:r>
+              <w:rPr>
+                <w:rFonts w:cs="Arial"/>
+                <w:color w:val="000000" w:themeColor="text1"/>
+                <w:sz w:val="15"/>
+              </w:rPr>
+              <w:t>duração</w:t>
+            </w:r>
+            <w:proofErr w:type="spellEnd"/>
+            <w:r>
+              <w:rPr>
+                <w:rFonts w:cs="Arial"/>
+                <w:color w:val="000000" w:themeColor="text1"/>
+                <w:sz w:val="15"/>
+              </w:rPr>
+              <w:t xml:space="preserve"> e </w:t>
+            </w:r>
+            <w:proofErr w:type="spellStart"/>
+            <w:r>
+              <w:rPr>
+                <w:rFonts w:cs="Arial"/>
+                <w:color w:val="000000" w:themeColor="text1"/>
+                <w:sz w:val="15"/>
+              </w:rPr>
+              <w:t>erros</w:t>
+            </w:r>
+            <w:proofErr w:type="spellEnd"/>
+            <w:r>
+              <w:rPr>
+                <w:rFonts w:cs="Arial"/>
+                <w:color w:val="000000" w:themeColor="text1"/>
+                <w:sz w:val="15"/>
+              </w:rPr>
+              <w:t>.</w:t>
+            </w:r>
+          </w:p>
+          <w:p>
+            <w:pPr>
+              <w:spacing w:after="0"/>
+              <w:jc w:val="center"/>
+              <w:rPr>
+                <w:rFonts w:cs="Arial"/>
+                <w:color w:val="000000" w:themeColor="text1"/>
+              </w:rPr>
+            </w:pPr>
+            <w:r>
+              <w:drawing>
+                <wp:inline distT="0" distB="0" distL="0" distR="0" wp14:anchorId="39C5AAA6" wp14:editId="442E7BD1">
+                  <wp:extent cx="1405646" cy="545465"/>
+                  <wp:effectExtent l="0" t="0" r="4445" b="6985"/>
+                  <wp:docPr id="1708986958" name="Imagem 1"/>
+                  <wp:cNvGraphicFramePr>
+                    <a:graphicFrameLocks xmlns:a="http://schemas.openxmlformats.org/drawingml/2006/main" noChangeAspect="1"/>
+                  </wp:cNvGraphicFramePr>
+                  <a:graphic xmlns:a="http://schemas.openxmlformats.org/drawingml/2006/main">
+                    <a:graphicData uri="http://schemas.openxmlformats.org/drawingml/2006/picture">
+                      <pic:pic xmlns:pic="http://schemas.openxmlformats.org/drawingml/2006/picture">
+                        <pic:nvPicPr>
+                          <pic:cNvPr id="1708986958" name=""/>
+                          <pic:cNvPicPr/>
+                        </pic:nvPicPr>
+                        <pic:blipFill>
+                          <a:blip r:embed="rId11"/>
+                          <a:stretch>
+                            <a:fillRect/>
+                          </a:stretch>
+                        </pic:blipFill>
+                        <pic:spPr>
+                          <a:xfrm>
+                            <a:off x="0" y="0"/>
+                            <a:ext cx="1498841" cy="581630"/>
+                          </a:xfrm>
+                          <a:prstGeom prst="rect">
+                            <a:avLst/>
+                          </a:prstGeom>
+                        </pic:spPr>
+                      </pic:pic>
+                    </a:graphicData>
+                  </a:graphic>
+                </wp:inline>
+              </w:drawing>
             </w:r>
           </w:p>
         </w:tc>
@@ -4951,7 +5130,7 @@
                           </pic:cNvPicPr>
                         </pic:nvPicPr>
                         <pic:blipFill>
-                          <a:blip r:embed="rId11">
+                          <a:blip r:embed="rId12">
                             <a:extLst>
                               <a:ext uri="{28A0092B-C50C-407E-A947-70E740481C1C}">
                                 <a14:useLocalDpi xmlns:a14="http://schemas.microsoft.com/office/drawing/2010/main" val="0"/>
@@ -5007,6 +5186,7 @@
               <w:rPr>
                 <w:rFonts w:cs="Arial"/>
                 <w:color w:val="000000" w:themeColor="text1"/>
+                <w:sz w:val="15"/>
               </w:rPr>
             </w:pPr>
             <w:r>
@@ -5015,7 +5195,108 @@
                 <w:color w:val="000000" w:themeColor="text1"/>
                 <w:sz w:val="15"/>
               </w:rPr>
-              <w:t>Publicar função HTTP, selecionar runtime/região e definir política de invocação.</w:t>
+              <w:t xml:space="preserve">Publicar função HTTP, selecionar runtime/região e </w:t>
+            </w:r>
+            <w:proofErr w:type="spellStart"/>
+            <w:r>
+              <w:rPr>
+                <w:rFonts w:cs="Arial"/>
+                <w:color w:val="000000" w:themeColor="text1"/>
+                <w:sz w:val="15"/>
+              </w:rPr>
+              <w:t>definir</w:t>
+            </w:r>
+            <w:proofErr w:type="spellEnd"/>
+            <w:r>
+              <w:rPr>
+                <w:rFonts w:cs="Arial"/>
+                <w:color w:val="000000" w:themeColor="text1"/>
+                <w:sz w:val="15"/>
+              </w:rPr>
+              <w:t xml:space="preserve"> </w:t>
+            </w:r>
+            <w:proofErr w:type="spellStart"/>
+            <w:r>
+              <w:rPr>
+                <w:rFonts w:cs="Arial"/>
+                <w:color w:val="000000" w:themeColor="text1"/>
+                <w:sz w:val="15"/>
+              </w:rPr>
+              <w:t>política</w:t>
+            </w:r>
+            <w:proofErr w:type="spellEnd"/>
+            <w:r>
+              <w:rPr>
+                <w:rFonts w:cs="Arial"/>
+                <w:color w:val="000000" w:themeColor="text1"/>
+                <w:sz w:val="15"/>
+              </w:rPr>
+              <w:t xml:space="preserve"> de </w:t>
+            </w:r>
+            <w:proofErr w:type="spellStart"/>
+            <w:r>
+              <w:rPr>
+                <w:rFonts w:cs="Arial"/>
+                <w:color w:val="000000" w:themeColor="text1"/>
+                <w:sz w:val="15"/>
+              </w:rPr>
+              <w:t>invocação</w:t>
+            </w:r>
+            <w:proofErr w:type="spellEnd"/>
+            <w:r>
+              <w:rPr>
+                <w:rFonts w:cs="Arial"/>
+                <w:color w:val="000000" w:themeColor="text1"/>
+                <w:sz w:val="15"/>
+              </w:rPr>
+              <w:t>.</w:t>
+            </w:r>
+          </w:p>
+          <w:p>
+            <w:pPr>
+              <w:spacing w:after="0"/>
+              <w:jc w:val="center"/>
+              <w:rPr>
+                <w:rFonts w:cs="Arial"/>
+                <w:color w:val="000000" w:themeColor="text1"/>
+              </w:rPr>
+            </w:pPr>
+            <w:r>
+              <w:drawing>
+                <wp:inline distT="0" distB="0" distL="0" distR="0" wp14:anchorId="02E1E2BA" wp14:editId="183DB7DE">
+                  <wp:extent cx="1203267" cy="625475"/>
+                  <wp:effectExtent l="0" t="0" r="0" b="3175"/>
+                  <wp:docPr id="1858634927" name="Imagem 1"/>
+                  <wp:cNvGraphicFramePr>
+                    <a:graphicFrameLocks xmlns:a="http://schemas.openxmlformats.org/drawingml/2006/main" noChangeAspect="1"/>
+                  </wp:cNvGraphicFramePr>
+                  <a:graphic xmlns:a="http://schemas.openxmlformats.org/drawingml/2006/main">
+                    <a:graphicData uri="http://schemas.openxmlformats.org/drawingml/2006/picture">
+                      <pic:pic xmlns:pic="http://schemas.openxmlformats.org/drawingml/2006/picture">
+                        <pic:nvPicPr>
+                          <pic:cNvPr id="1858634927" name=""/>
+                          <pic:cNvPicPr/>
+                        </pic:nvPicPr>
+                        <pic:blipFill>
+                          <a:blip r:embed="rId13"/>
+                          <a:stretch>
+                            <a:fillRect/>
+                          </a:stretch>
+                        </pic:blipFill>
+                        <pic:spPr>
+                          <a:xfrm>
+                            <a:off x="0" y="0"/>
+                            <a:ext cx="1265374" cy="657759"/>
+                          </a:xfrm>
+                          <a:prstGeom prst="rect">
+                            <a:avLst/>
+                          </a:prstGeom>
+                        </pic:spPr>
+                      </pic:pic>
+                    </a:graphicData>
+                  </a:graphic>
+                </wp:inline>
+              </w:drawing>
             </w:r>
           </w:p>
         </w:tc>
@@ -5146,7 +5427,7 @@
                           </pic:cNvPicPr>
                         </pic:nvPicPr>
                         <pic:blipFill>
-                          <a:blip r:embed="rId12">
+                          <a:blip r:embed="rId14">
                             <a:extLst>
                               <a:ext uri="{28A0092B-C50C-407E-A947-70E740481C1C}">
                                 <a14:useLocalDpi xmlns:a14="http://schemas.microsoft.com/office/drawing/2010/main" val="0"/>
@@ -5193,6 +5474,7 @@
               <w:rPr>
                 <w:rFonts w:cs="Arial"/>
                 <w:color w:val="000000" w:themeColor="text1"/>
+                <w:sz w:val="15"/>
               </w:rPr>
             </w:pPr>
             <w:r>
@@ -5201,7 +5483,108 @@
                 <w:color w:val="000000" w:themeColor="text1"/>
                 <w:sz w:val="15"/>
               </w:rPr>
-              <w:t>Testar endpoint, JSON, CORS, permissões e comportamento em caso de falha.</w:t>
+              <w:t xml:space="preserve">Testar endpoint, JSON, CORS, permissões e comportamento </w:t>
+            </w:r>
+            <w:proofErr w:type="spellStart"/>
+            <w:r>
+              <w:rPr>
+                <w:rFonts w:cs="Arial"/>
+                <w:color w:val="000000" w:themeColor="text1"/>
+                <w:sz w:val="15"/>
+              </w:rPr>
+              <w:t>em</w:t>
+            </w:r>
+            <w:proofErr w:type="spellEnd"/>
+            <w:r>
+              <w:rPr>
+                <w:rFonts w:cs="Arial"/>
+                <w:color w:val="000000" w:themeColor="text1"/>
+                <w:sz w:val="15"/>
+              </w:rPr>
+              <w:t xml:space="preserve"> </w:t>
+            </w:r>
+            <w:proofErr w:type="spellStart"/>
+            <w:r>
+              <w:rPr>
+                <w:rFonts w:cs="Arial"/>
+                <w:color w:val="000000" w:themeColor="text1"/>
+                <w:sz w:val="15"/>
+              </w:rPr>
+              <w:t>caso</w:t>
+            </w:r>
+            <w:proofErr w:type="spellEnd"/>
+            <w:r>
+              <w:rPr>
+                <w:rFonts w:cs="Arial"/>
+                <w:color w:val="000000" w:themeColor="text1"/>
+                <w:sz w:val="15"/>
+              </w:rPr>
+              <w:t xml:space="preserve"> de </w:t>
+            </w:r>
+            <w:proofErr w:type="spellStart"/>
+            <w:r>
+              <w:rPr>
+                <w:rFonts w:cs="Arial"/>
+                <w:color w:val="000000" w:themeColor="text1"/>
+                <w:sz w:val="15"/>
+              </w:rPr>
+              <w:t>falha</w:t>
+            </w:r>
+            <w:proofErr w:type="spellEnd"/>
+            <w:r>
+              <w:rPr>
+                <w:rFonts w:cs="Arial"/>
+                <w:color w:val="000000" w:themeColor="text1"/>
+                <w:sz w:val="15"/>
+              </w:rPr>
+              <w:t>.</w:t>
+            </w:r>
+          </w:p>
+          <w:p>
+            <w:pPr>
+              <w:spacing w:after="0"/>
+              <w:jc w:val="center"/>
+              <w:rPr>
+                <w:rFonts w:cs="Arial"/>
+                <w:color w:val="000000" w:themeColor="text1"/>
+              </w:rPr>
+            </w:pPr>
+            <w:r>
+              <w:drawing>
+                <wp:inline distT="0" distB="0" distL="0" distR="0" wp14:anchorId="0988B90E" wp14:editId="70CB80B5">
+                  <wp:extent cx="1400464" cy="425380"/>
+                  <wp:effectExtent l="0" t="0" r="0" b="0"/>
+                  <wp:docPr id="1710554382" name="Imagem 1"/>
+                  <wp:cNvGraphicFramePr>
+                    <a:graphicFrameLocks xmlns:a="http://schemas.openxmlformats.org/drawingml/2006/main" noChangeAspect="1"/>
+                  </wp:cNvGraphicFramePr>
+                  <a:graphic xmlns:a="http://schemas.openxmlformats.org/drawingml/2006/main">
+                    <a:graphicData uri="http://schemas.openxmlformats.org/drawingml/2006/picture">
+                      <pic:pic xmlns:pic="http://schemas.openxmlformats.org/drawingml/2006/picture">
+                        <pic:nvPicPr>
+                          <pic:cNvPr id="1710554382" name=""/>
+                          <pic:cNvPicPr/>
+                        </pic:nvPicPr>
+                        <pic:blipFill>
+                          <a:blip r:embed="rId15"/>
+                          <a:stretch>
+                            <a:fillRect/>
+                          </a:stretch>
+                        </pic:blipFill>
+                        <pic:spPr>
+                          <a:xfrm>
+                            <a:off x="0" y="0"/>
+                            <a:ext cx="1475904" cy="448294"/>
+                          </a:xfrm>
+                          <a:prstGeom prst="rect">
+                            <a:avLst/>
+                          </a:prstGeom>
+                        </pic:spPr>
+                      </pic:pic>
+                    </a:graphicData>
+                  </a:graphic>
+                </wp:inline>
+              </w:drawing>
             </w:r>
           </w:p>
         </w:tc>
@@ -5938,8 +6321,8 @@
       </w:r>
     </w:p>
     <w:sectPr>
-      <w:headerReference w:type="default" r:id="rId13"/>
-      <w:footerReference w:type="default" r:id="rId14"/>
+      <w:headerReference w:type="default" r:id="rId16"/>
+      <w:footerReference w:type="default" r:id="rId17"/>
       <w:pgSz w:w="12240" w:h="15840"/>
       <w:pgMar w:top="936" w:right="1008" w:bottom="936" w:left="1008" w:header="720" w:footer="720" w:gutter="0"/>
       <w:cols w:space="720"/>
@@ -6020,6 +6403,7 @@
         <w:docPartUnique/>
       </w:docPartObj>
     </w:sdtPr>
+    <w:sdtEndPr/>
     <w:sdtContent>
       <w:p>
         <w:pPr>

</xml_diff>

<commit_message>
feat: add frontend web application and update technical documentation
</commit_message>
<xml_diff>
--- a/Documentacao_Tecnica_IHMInvest_Multicloud.docx
+++ b/Documentacao_Tecnica_IHMInvest_Multicloud.docx
@@ -22,7 +22,6 @@
           <w:sz w:val="56"/>
         </w:rPr>
       </w:pPr>
-      <w:proofErr w:type="spellStart"/>
       <w:r>
         <w:rPr>
           <w:rFonts w:cs="Arial"/>
@@ -32,7 +31,6 @@
         </w:rPr>
         <w:t>IHMInvest</w:t>
       </w:r>
-      <w:proofErr w:type="spellEnd"/>
     </w:p>
     <w:p>
       <w:pPr>
@@ -88,52 +86,14 @@
           <w:sz w:val="26"/>
         </w:rPr>
       </w:pPr>
-      <w:proofErr w:type="spellStart"/>
       <w:r>
         <w:rPr>
           <w:rFonts w:cs="Arial"/>
           <w:color w:val="000000" w:themeColor="text1"/>
           <w:sz w:val="26"/>
         </w:rPr>
-        <w:t>Ecossistema</w:t>
+        <w:t>Ecossistema SaaS Financeiro Multicloud</w:t>
       </w:r>
-      <w:proofErr w:type="spellEnd"/>
-      <w:r>
-        <w:rPr>
-          <w:rFonts w:cs="Arial"/>
-          <w:color w:val="000000" w:themeColor="text1"/>
-          <w:sz w:val="26"/>
-        </w:rPr>
-        <w:t xml:space="preserve"> SaaS </w:t>
-      </w:r>
-      <w:proofErr w:type="spellStart"/>
-      <w:r>
-        <w:rPr>
-          <w:rFonts w:cs="Arial"/>
-          <w:color w:val="000000" w:themeColor="text1"/>
-          <w:sz w:val="26"/>
-        </w:rPr>
-        <w:t>Financeiro</w:t>
-      </w:r>
-      <w:proofErr w:type="spellEnd"/>
-      <w:r>
-        <w:rPr>
-          <w:rFonts w:cs="Arial"/>
-          <w:color w:val="000000" w:themeColor="text1"/>
-          <w:sz w:val="26"/>
-        </w:rPr>
-        <w:t xml:space="preserve"> </w:t>
-      </w:r>
-      <w:proofErr w:type="spellStart"/>
-      <w:r>
-        <w:rPr>
-          <w:rFonts w:cs="Arial"/>
-          <w:color w:val="000000" w:themeColor="text1"/>
-          <w:sz w:val="26"/>
-        </w:rPr>
-        <w:t>Multicloud</w:t>
-      </w:r>
-      <w:proofErr w:type="spellEnd"/>
     </w:p>
     <w:p>
       <w:pPr>
@@ -159,39 +119,7 @@
           <w:rFonts w:cs="Arial"/>
           <w:color w:val="000000" w:themeColor="text1"/>
         </w:rPr>
-        <w:t xml:space="preserve">AWS </w:t>
-      </w:r>
-      <w:proofErr w:type="gramStart"/>
-      <w:r>
-        <w:rPr>
-          <w:rFonts w:cs="Arial"/>
-          <w:color w:val="000000" w:themeColor="text1"/>
-        </w:rPr>
-        <w:t>Lambda  |</w:t>
-      </w:r>
-      <w:proofErr w:type="gramEnd"/>
-      <w:r>
-        <w:rPr>
-          <w:rFonts w:cs="Arial"/>
-          <w:color w:val="000000" w:themeColor="text1"/>
-        </w:rPr>
-        <w:t xml:space="preserve">  Microsoft Azure </w:t>
-      </w:r>
-      <w:proofErr w:type="gramStart"/>
-      <w:r>
-        <w:rPr>
-          <w:rFonts w:cs="Arial"/>
-          <w:color w:val="000000" w:themeColor="text1"/>
-        </w:rPr>
-        <w:t>Functions  |</w:t>
-      </w:r>
-      <w:proofErr w:type="gramEnd"/>
-      <w:r>
-        <w:rPr>
-          <w:rFonts w:cs="Arial"/>
-          <w:color w:val="000000" w:themeColor="text1"/>
-        </w:rPr>
-        <w:t xml:space="preserve">  Google Cloud Functions</w:t>
+        <w:t>AWS Lambda  |  Microsoft Azure Functions  |  Google Cloud Functions</w:t>
       </w:r>
     </w:p>
     <w:p>
@@ -212,59 +140,8 @@
           <w:color w:val="000000" w:themeColor="text1"/>
           <w:sz w:val="22"/>
         </w:rPr>
-        <w:t xml:space="preserve">Grupo A — </w:t>
+        <w:t>Grupo A — Análise e projeção de investimentos</w:t>
       </w:r>
-      <w:proofErr w:type="spellStart"/>
-      <w:r>
-        <w:rPr>
-          <w:rFonts w:cs="Arial"/>
-          <w:b/>
-          <w:color w:val="000000" w:themeColor="text1"/>
-          <w:sz w:val="22"/>
-        </w:rPr>
-        <w:t>Análise</w:t>
-      </w:r>
-      <w:proofErr w:type="spellEnd"/>
-      <w:r>
-        <w:rPr>
-          <w:rFonts w:cs="Arial"/>
-          <w:b/>
-          <w:color w:val="000000" w:themeColor="text1"/>
-          <w:sz w:val="22"/>
-        </w:rPr>
-        <w:t xml:space="preserve"> e </w:t>
-      </w:r>
-      <w:proofErr w:type="spellStart"/>
-      <w:r>
-        <w:rPr>
-          <w:rFonts w:cs="Arial"/>
-          <w:b/>
-          <w:color w:val="000000" w:themeColor="text1"/>
-          <w:sz w:val="22"/>
-        </w:rPr>
-        <w:t>projeção</w:t>
-      </w:r>
-      <w:proofErr w:type="spellEnd"/>
-      <w:r>
-        <w:rPr>
-          <w:rFonts w:cs="Arial"/>
-          <w:b/>
-          <w:color w:val="000000" w:themeColor="text1"/>
-          <w:sz w:val="22"/>
-        </w:rPr>
-        <w:t xml:space="preserve"> de </w:t>
-      </w:r>
-      <w:proofErr w:type="spellStart"/>
-      <w:r>
-        <w:rPr>
-          <w:rFonts w:cs="Arial"/>
-          <w:b/>
-          <w:color w:val="000000" w:themeColor="text1"/>
-          <w:sz w:val="22"/>
-        </w:rPr>
-        <w:t>investimentos</w:t>
-      </w:r>
-      <w:proofErr w:type="spellEnd"/>
     </w:p>
     <w:p>
       <w:pPr>
@@ -322,23 +199,13 @@
           <w:sz w:val="18"/>
         </w:rPr>
       </w:pPr>
-      <w:proofErr w:type="spellStart"/>
       <w:r>
         <w:rPr>
           <w:rFonts w:cs="Arial"/>
           <w:color w:val="000000" w:themeColor="text1"/>
           <w:sz w:val="18"/>
         </w:rPr>
-        <w:t>Repositório</w:t>
-      </w:r>
-      <w:proofErr w:type="spellEnd"/>
-      <w:r>
-        <w:rPr>
-          <w:rFonts w:cs="Arial"/>
-          <w:color w:val="000000" w:themeColor="text1"/>
-          <w:sz w:val="18"/>
-        </w:rPr>
-        <w:t xml:space="preserve">: </w:t>
+        <w:t xml:space="preserve">Repositório: </w:t>
       </w:r>
       <w:hyperlink r:id="rId8" w:history="1">
         <w:r>
@@ -347,18 +214,8 @@
             <w:rFonts w:cs="Arial"/>
             <w:sz w:val="18"/>
           </w:rPr>
-          <w:t>github.com/Pedro-Cavenaghi/</w:t>
+          <w:t>github.com/Pedro-Cavenaghi/Saasmulticloud</w:t>
         </w:r>
-        <w:proofErr w:type="spellStart"/>
-        <w:r>
-          <w:rPr>
-            <w:rStyle w:val="Hyperlink"/>
-            <w:rFonts w:cs="Arial"/>
-            <w:sz w:val="18"/>
-          </w:rPr>
-          <w:t>Saasmulticloud</w:t>
-        </w:r>
-        <w:proofErr w:type="spellEnd"/>
       </w:hyperlink>
     </w:p>
     <w:p>
@@ -505,29 +362,7 @@
           <w:sz w:val="24"/>
           <w:szCs w:val="24"/>
         </w:rPr>
-        <w:t xml:space="preserve">João Luís </w:t>
-      </w:r>
-      <w:proofErr w:type="gramStart"/>
-      <w:r>
-        <w:rPr>
-          <w:rFonts w:eastAsia="Arial Black" w:cs="Arial"/>
-          <w:b/>
-          <w:bCs/>
-          <w:sz w:val="24"/>
-          <w:szCs w:val="24"/>
-        </w:rPr>
-        <w:t>Da</w:t>
-      </w:r>
-      <w:proofErr w:type="gramEnd"/>
-      <w:r>
-        <w:rPr>
-          <w:rFonts w:eastAsia="Arial Black" w:cs="Arial"/>
-          <w:b/>
-          <w:bCs/>
-          <w:sz w:val="24"/>
-          <w:szCs w:val="24"/>
-        </w:rPr>
-        <w:t xml:space="preserve"> Silva</w:t>
+        <w:t>João Luís Da Silva</w:t>
       </w:r>
     </w:p>
     <w:p>
@@ -664,29 +499,7 @@
           <w:color w:val="000000" w:themeColor="text1"/>
           <w:szCs w:val="24"/>
         </w:rPr>
-        <w:t xml:space="preserve">26 de </w:t>
-      </w:r>
-      <w:proofErr w:type="spellStart"/>
-      <w:r>
-        <w:rPr>
-          <w:rFonts w:cs="Arial"/>
-          <w:b/>
-          <w:bCs/>
-          <w:color w:val="000000" w:themeColor="text1"/>
-          <w:szCs w:val="24"/>
-        </w:rPr>
-        <w:t>outubro</w:t>
-      </w:r>
-      <w:proofErr w:type="spellEnd"/>
-      <w:r>
-        <w:rPr>
-          <w:rFonts w:cs="Arial"/>
-          <w:b/>
-          <w:bCs/>
-          <w:color w:val="000000" w:themeColor="text1"/>
-          <w:szCs w:val="24"/>
-        </w:rPr>
-        <w:t xml:space="preserve"> de 2026</w:t>
+        <w:t>26 de outubro de 2026</w:t>
       </w:r>
     </w:p>
     <w:p>
@@ -735,135 +548,7 @@
           <w:rFonts w:cs="Arial"/>
           <w:color w:val="000000" w:themeColor="text1"/>
         </w:rPr>
-        <w:t xml:space="preserve">O frontend é responsável por receber os dados, validar os campos, disparar as requisições, medir a latência e consolidar as respostas. Cada provedor executa uma responsabilidade específica. O dashboard mantém os módulos independentes para que a </w:t>
-      </w:r>
-      <w:proofErr w:type="spellStart"/>
-      <w:r>
-        <w:rPr>
-          <w:rFonts w:cs="Arial"/>
-          <w:color w:val="000000" w:themeColor="text1"/>
-        </w:rPr>
-        <w:t>falha</w:t>
-      </w:r>
-      <w:proofErr w:type="spellEnd"/>
-      <w:r>
-        <w:rPr>
-          <w:rFonts w:cs="Arial"/>
-          <w:color w:val="000000" w:themeColor="text1"/>
-        </w:rPr>
-        <w:t xml:space="preserve"> de um </w:t>
-      </w:r>
-      <w:proofErr w:type="spellStart"/>
-      <w:r>
-        <w:rPr>
-          <w:rFonts w:cs="Arial"/>
-          <w:color w:val="000000" w:themeColor="text1"/>
-        </w:rPr>
-        <w:t>serviço</w:t>
-      </w:r>
-      <w:proofErr w:type="spellEnd"/>
-      <w:r>
-        <w:rPr>
-          <w:rFonts w:cs="Arial"/>
-          <w:color w:val="000000" w:themeColor="text1"/>
-        </w:rPr>
-        <w:t xml:space="preserve"> </w:t>
-      </w:r>
-      <w:proofErr w:type="spellStart"/>
-      <w:r>
-        <w:rPr>
-          <w:rFonts w:cs="Arial"/>
-          <w:color w:val="000000" w:themeColor="text1"/>
-        </w:rPr>
-        <w:t>não</w:t>
-      </w:r>
-      <w:proofErr w:type="spellEnd"/>
-      <w:r>
-        <w:rPr>
-          <w:rFonts w:cs="Arial"/>
-          <w:color w:val="000000" w:themeColor="text1"/>
-        </w:rPr>
-        <w:t xml:space="preserve"> </w:t>
-      </w:r>
-      <w:proofErr w:type="spellStart"/>
-      <w:r>
-        <w:rPr>
-          <w:rFonts w:cs="Arial"/>
-          <w:color w:val="000000" w:themeColor="text1"/>
-        </w:rPr>
-        <w:t>impeça</w:t>
-      </w:r>
-      <w:proofErr w:type="spellEnd"/>
-      <w:r>
-        <w:rPr>
-          <w:rFonts w:cs="Arial"/>
-          <w:color w:val="000000" w:themeColor="text1"/>
-        </w:rPr>
-        <w:t xml:space="preserve"> </w:t>
-      </w:r>
-      <w:proofErr w:type="gramStart"/>
-      <w:r>
-        <w:rPr>
-          <w:rFonts w:cs="Arial"/>
-          <w:color w:val="000000" w:themeColor="text1"/>
-        </w:rPr>
-        <w:t>a</w:t>
-      </w:r>
-      <w:proofErr w:type="gramEnd"/>
-      <w:r>
-        <w:rPr>
-          <w:rFonts w:cs="Arial"/>
-          <w:color w:val="000000" w:themeColor="text1"/>
-        </w:rPr>
-        <w:t xml:space="preserve"> </w:t>
-      </w:r>
-      <w:proofErr w:type="spellStart"/>
-      <w:r>
-        <w:rPr>
-          <w:rFonts w:cs="Arial"/>
-          <w:color w:val="000000" w:themeColor="text1"/>
-        </w:rPr>
-        <w:t>apresentação</w:t>
-      </w:r>
-      <w:proofErr w:type="spellEnd"/>
-      <w:r>
-        <w:rPr>
-          <w:rFonts w:cs="Arial"/>
-          <w:color w:val="000000" w:themeColor="text1"/>
-        </w:rPr>
-        <w:t xml:space="preserve"> dos </w:t>
-      </w:r>
-      <w:proofErr w:type="spellStart"/>
-      <w:r>
-        <w:rPr>
-          <w:rFonts w:cs="Arial"/>
-          <w:color w:val="000000" w:themeColor="text1"/>
-        </w:rPr>
-        <w:t>resultados</w:t>
-      </w:r>
-      <w:proofErr w:type="spellEnd"/>
-      <w:r>
-        <w:rPr>
-          <w:rFonts w:cs="Arial"/>
-          <w:color w:val="000000" w:themeColor="text1"/>
-        </w:rPr>
-        <w:t xml:space="preserve"> dos </w:t>
-      </w:r>
-      <w:proofErr w:type="spellStart"/>
-      <w:r>
-        <w:rPr>
-          <w:rFonts w:cs="Arial"/>
-          <w:color w:val="000000" w:themeColor="text1"/>
-        </w:rPr>
-        <w:t>demais</w:t>
-      </w:r>
-      <w:proofErr w:type="spellEnd"/>
-      <w:r>
-        <w:rPr>
-          <w:rFonts w:cs="Arial"/>
-          <w:color w:val="000000" w:themeColor="text1"/>
-        </w:rPr>
-        <w:t>.</w:t>
+        <w:t>O frontend é responsável por receber os dados, validar os campos, disparar as requisições, medir a latência e consolidar as respostas. Cada provedor executa uma responsabilidade específica. O dashboard mantém os módulos independentes para que a falha de um serviço não impeça a apresentação dos resultados dos demais.</w:t>
       </w:r>
     </w:p>
     <w:p>
@@ -1406,135 +1091,7 @@
           <w:rFonts w:cs="Arial"/>
           <w:color w:val="000000" w:themeColor="text1"/>
         </w:rPr>
-        <w:t xml:space="preserve">As três funções expõem endpoints HTTP do método POST e recebem dados JSON. As respostas de sucesso usam HTTP 200; entradas inválidas devem retornar HTTP 400 e falhas internas, HTTP 500. </w:t>
-      </w:r>
-      <w:proofErr w:type="spellStart"/>
-      <w:r>
-        <w:rPr>
-          <w:rFonts w:cs="Arial"/>
-          <w:color w:val="000000" w:themeColor="text1"/>
-        </w:rPr>
-        <w:t>Os</w:t>
-      </w:r>
-      <w:proofErr w:type="spellEnd"/>
-      <w:r>
-        <w:rPr>
-          <w:rFonts w:cs="Arial"/>
-          <w:color w:val="000000" w:themeColor="text1"/>
-        </w:rPr>
-        <w:t xml:space="preserve"> </w:t>
-      </w:r>
-      <w:proofErr w:type="spellStart"/>
-      <w:r>
-        <w:rPr>
-          <w:rFonts w:cs="Arial"/>
-          <w:color w:val="000000" w:themeColor="text1"/>
-        </w:rPr>
-        <w:t>exemplos</w:t>
-      </w:r>
-      <w:proofErr w:type="spellEnd"/>
-      <w:r>
-        <w:rPr>
-          <w:rFonts w:cs="Arial"/>
-          <w:color w:val="000000" w:themeColor="text1"/>
-        </w:rPr>
-        <w:t xml:space="preserve"> </w:t>
-      </w:r>
-      <w:proofErr w:type="spellStart"/>
-      <w:r>
-        <w:rPr>
-          <w:rFonts w:cs="Arial"/>
-          <w:color w:val="000000" w:themeColor="text1"/>
-        </w:rPr>
-        <w:t>abaixo</w:t>
-      </w:r>
-      <w:proofErr w:type="spellEnd"/>
-      <w:r>
-        <w:rPr>
-          <w:rFonts w:cs="Arial"/>
-          <w:color w:val="000000" w:themeColor="text1"/>
-        </w:rPr>
-        <w:t xml:space="preserve"> </w:t>
-      </w:r>
-      <w:proofErr w:type="spellStart"/>
-      <w:r>
-        <w:rPr>
-          <w:rFonts w:cs="Arial"/>
-          <w:color w:val="000000" w:themeColor="text1"/>
-        </w:rPr>
-        <w:t>definem</w:t>
-      </w:r>
-      <w:proofErr w:type="spellEnd"/>
-      <w:r>
-        <w:rPr>
-          <w:rFonts w:cs="Arial"/>
-          <w:color w:val="000000" w:themeColor="text1"/>
-        </w:rPr>
-        <w:t xml:space="preserve"> </w:t>
-      </w:r>
-      <w:proofErr w:type="spellStart"/>
-      <w:r>
-        <w:rPr>
-          <w:rFonts w:cs="Arial"/>
-          <w:color w:val="000000" w:themeColor="text1"/>
-        </w:rPr>
-        <w:t>os</w:t>
-      </w:r>
-      <w:proofErr w:type="spellEnd"/>
-      <w:r>
-        <w:rPr>
-          <w:rFonts w:cs="Arial"/>
-          <w:color w:val="000000" w:themeColor="text1"/>
-        </w:rPr>
-        <w:t xml:space="preserve"> </w:t>
-      </w:r>
-      <w:proofErr w:type="spellStart"/>
-      <w:r>
-        <w:rPr>
-          <w:rFonts w:cs="Arial"/>
-          <w:color w:val="000000" w:themeColor="text1"/>
-        </w:rPr>
-        <w:t>contratos</w:t>
-      </w:r>
-      <w:proofErr w:type="spellEnd"/>
-      <w:r>
-        <w:rPr>
-          <w:rFonts w:cs="Arial"/>
-          <w:color w:val="000000" w:themeColor="text1"/>
-        </w:rPr>
-        <w:t xml:space="preserve"> </w:t>
-      </w:r>
-      <w:proofErr w:type="spellStart"/>
-      <w:r>
-        <w:rPr>
-          <w:rFonts w:cs="Arial"/>
-          <w:color w:val="000000" w:themeColor="text1"/>
-        </w:rPr>
-        <w:t>utilizados</w:t>
-      </w:r>
-      <w:proofErr w:type="spellEnd"/>
-      <w:r>
-        <w:rPr>
-          <w:rFonts w:cs="Arial"/>
-          <w:color w:val="000000" w:themeColor="text1"/>
-        </w:rPr>
-        <w:t xml:space="preserve"> pela </w:t>
-      </w:r>
-      <w:proofErr w:type="spellStart"/>
-      <w:r>
-        <w:rPr>
-          <w:rFonts w:cs="Arial"/>
-          <w:color w:val="000000" w:themeColor="text1"/>
-        </w:rPr>
-        <w:t>aplicação</w:t>
-      </w:r>
-      <w:proofErr w:type="spellEnd"/>
-      <w:r>
-        <w:rPr>
-          <w:rFonts w:cs="Arial"/>
-          <w:color w:val="000000" w:themeColor="text1"/>
-        </w:rPr>
-        <w:t>.</w:t>
+        <w:t>As três funções expõem endpoints HTTP do método POST e recebem dados JSON. As respostas de sucesso usam HTTP 200; entradas inválidas devem retornar HTTP 400 e falhas internas, HTTP 500. Os exemplos abaixo definem os contratos utilizados pela aplicação.</w:t>
       </w:r>
     </w:p>
     <w:p>
@@ -1866,23 +1423,7 @@
           <w:color w:val="000000" w:themeColor="text1"/>
         </w:rPr>
         <w:lastRenderedPageBreak/>
-        <w:t xml:space="preserve">Request — </w:t>
-      </w:r>
-      <w:proofErr w:type="spellStart"/>
-      <w:r>
-        <w:rPr>
-          <w:rFonts w:cs="Arial"/>
-          <w:color w:val="000000" w:themeColor="text1"/>
-        </w:rPr>
-        <w:t>exemplo</w:t>
-      </w:r>
-      <w:proofErr w:type="spellEnd"/>
-      <w:r>
-        <w:rPr>
-          <w:rFonts w:cs="Arial"/>
-          <w:color w:val="000000" w:themeColor="text1"/>
-        </w:rPr>
-        <w:t xml:space="preserve"> de entrada:</w:t>
+        <w:t>Request — exemplo de entrada:</w:t>
       </w:r>
     </w:p>
     <w:tbl>
@@ -2043,25 +1584,7 @@
                 <w:color w:val="000000" w:themeColor="text1"/>
                 <w:sz w:val="17"/>
               </w:rPr>
-              <w:t>"</w:t>
-            </w:r>
-            <w:proofErr w:type="spellStart"/>
-            <w:r>
-              <w:rPr>
-                <w:rFonts w:cs="Arial"/>
-                <w:color w:val="000000" w:themeColor="text1"/>
-                <w:sz w:val="17"/>
-              </w:rPr>
-              <w:t>provedor</w:t>
-            </w:r>
-            <w:proofErr w:type="spellEnd"/>
-            <w:r>
-              <w:rPr>
-                <w:rFonts w:cs="Arial"/>
-                <w:color w:val="000000" w:themeColor="text1"/>
-                <w:sz w:val="17"/>
-              </w:rPr>
-              <w:t>": "Azure",</w:t>
+              <w:t>"provedor": "Azure",</w:t>
             </w:r>
           </w:p>
           <w:p>
@@ -2079,25 +1602,7 @@
                 <w:color w:val="000000" w:themeColor="text1"/>
                 <w:sz w:val="17"/>
               </w:rPr>
-              <w:t xml:space="preserve">  "</w:t>
-            </w:r>
-            <w:proofErr w:type="spellStart"/>
-            <w:r>
-              <w:rPr>
-                <w:rFonts w:cs="Arial"/>
-                <w:color w:val="000000" w:themeColor="text1"/>
-                <w:sz w:val="17"/>
-              </w:rPr>
-              <w:t>valorReais</w:t>
-            </w:r>
-            <w:proofErr w:type="spellEnd"/>
-            <w:r>
-              <w:rPr>
-                <w:rFonts w:cs="Arial"/>
-                <w:color w:val="000000" w:themeColor="text1"/>
-                <w:sz w:val="17"/>
-              </w:rPr>
-              <w:t>": 1000,</w:t>
+              <w:t xml:space="preserve">  "valorReais": 1000,</w:t>
             </w:r>
           </w:p>
           <w:p>
@@ -2115,25 +1620,7 @@
                 <w:color w:val="000000" w:themeColor="text1"/>
                 <w:sz w:val="17"/>
               </w:rPr>
-              <w:t xml:space="preserve">  "</w:t>
-            </w:r>
-            <w:proofErr w:type="spellStart"/>
-            <w:r>
-              <w:rPr>
-                <w:rFonts w:cs="Arial"/>
-                <w:color w:val="000000" w:themeColor="text1"/>
-                <w:sz w:val="17"/>
-              </w:rPr>
-              <w:t>valorDolar</w:t>
-            </w:r>
-            <w:proofErr w:type="spellEnd"/>
-            <w:r>
-              <w:rPr>
-                <w:rFonts w:cs="Arial"/>
-                <w:color w:val="000000" w:themeColor="text1"/>
-                <w:sz w:val="17"/>
-              </w:rPr>
-              <w:t>": 200,</w:t>
+              <w:t xml:space="preserve">  "valorDolar": 200,</w:t>
             </w:r>
           </w:p>
           <w:p>
@@ -2151,25 +1638,7 @@
                 <w:color w:val="000000" w:themeColor="text1"/>
                 <w:sz w:val="17"/>
               </w:rPr>
-              <w:t xml:space="preserve">  "</w:t>
-            </w:r>
-            <w:proofErr w:type="spellStart"/>
-            <w:r>
-              <w:rPr>
-                <w:rFonts w:cs="Arial"/>
-                <w:color w:val="000000" w:themeColor="text1"/>
-                <w:sz w:val="17"/>
-              </w:rPr>
-              <w:t>valorEuro</w:t>
-            </w:r>
-            <w:proofErr w:type="spellEnd"/>
-            <w:r>
-              <w:rPr>
-                <w:rFonts w:cs="Arial"/>
-                <w:color w:val="000000" w:themeColor="text1"/>
-                <w:sz w:val="17"/>
-              </w:rPr>
-              <w:t>": 160,</w:t>
+              <w:t xml:space="preserve">  "valorEuro": 160,</w:t>
             </w:r>
           </w:p>
           <w:p>
@@ -2187,25 +1656,7 @@
                 <w:color w:val="000000" w:themeColor="text1"/>
                 <w:sz w:val="17"/>
               </w:rPr>
-              <w:t xml:space="preserve">  "</w:t>
-            </w:r>
-            <w:proofErr w:type="spellStart"/>
-            <w:r>
-              <w:rPr>
-                <w:rFonts w:cs="Arial"/>
-                <w:color w:val="000000" w:themeColor="text1"/>
-                <w:sz w:val="17"/>
-              </w:rPr>
-              <w:t>cotacaoDolar</w:t>
-            </w:r>
-            <w:proofErr w:type="spellEnd"/>
-            <w:r>
-              <w:rPr>
-                <w:rFonts w:cs="Arial"/>
-                <w:color w:val="000000" w:themeColor="text1"/>
-                <w:sz w:val="17"/>
-              </w:rPr>
-              <w:t>": 5,</w:t>
+              <w:t xml:space="preserve">  "cotacaoDolar": 5,</w:t>
             </w:r>
           </w:p>
           <w:p>
@@ -2223,25 +1674,7 @@
                 <w:color w:val="000000" w:themeColor="text1"/>
                 <w:sz w:val="17"/>
               </w:rPr>
-              <w:t xml:space="preserve">  "</w:t>
-            </w:r>
-            <w:proofErr w:type="spellStart"/>
-            <w:r>
-              <w:rPr>
-                <w:rFonts w:cs="Arial"/>
-                <w:color w:val="000000" w:themeColor="text1"/>
-                <w:sz w:val="17"/>
-              </w:rPr>
-              <w:t>cotacaoEuro</w:t>
-            </w:r>
-            <w:proofErr w:type="spellEnd"/>
-            <w:r>
-              <w:rPr>
-                <w:rFonts w:cs="Arial"/>
-                <w:color w:val="000000" w:themeColor="text1"/>
-                <w:sz w:val="17"/>
-              </w:rPr>
-              <w:t>": 6.25,</w:t>
+              <w:t xml:space="preserve">  "cotacaoEuro": 6.25,</w:t>
             </w:r>
           </w:p>
           <w:p>
@@ -2258,25 +1691,7 @@
                 <w:color w:val="000000" w:themeColor="text1"/>
                 <w:sz w:val="17"/>
               </w:rPr>
-              <w:t xml:space="preserve">  "</w:t>
-            </w:r>
-            <w:proofErr w:type="spellStart"/>
-            <w:r>
-              <w:rPr>
-                <w:rFonts w:cs="Arial"/>
-                <w:color w:val="000000" w:themeColor="text1"/>
-                <w:sz w:val="17"/>
-              </w:rPr>
-              <w:t>cotacaoSimulada</w:t>
-            </w:r>
-            <w:proofErr w:type="spellEnd"/>
-            <w:r>
-              <w:rPr>
-                <w:rFonts w:cs="Arial"/>
-                <w:color w:val="000000" w:themeColor="text1"/>
-                <w:sz w:val="17"/>
-              </w:rPr>
-              <w:t>": true</w:t>
+              <w:t xml:space="preserve">  "cotacaoSimulada": true</w:t>
             </w:r>
             <w:r>
               <w:rPr>
@@ -2338,25 +1753,43 @@
           <w:color w:val="000000" w:themeColor="text1"/>
           <w:lang w:val="pt-BR"/>
         </w:rPr>
-        <w:t xml:space="preserve">- Linguagem: </w:t>
+        <w:t>- Linguagem: JavaScript.</w:t>
       </w:r>
-      <w:proofErr w:type="spellStart"/>
+    </w:p>
+    <w:p>
+      <w:pPr>
+        <w:spacing w:before="120" w:after="60"/>
+        <w:rPr>
+          <w:rFonts w:cs="Arial"/>
+          <w:color w:val="000000" w:themeColor="text1"/>
+          <w:lang w:val="pt-BR"/>
+        </w:rPr>
+      </w:pPr>
       <w:r>
         <w:rPr>
           <w:rFonts w:cs="Arial"/>
           <w:color w:val="000000" w:themeColor="text1"/>
           <w:lang w:val="pt-BR"/>
         </w:rPr>
-        <w:t>JavaScript</w:t>
+        <w:t>- Runtime: Node.js, conforme a implementação desenvolvida.</w:t>
       </w:r>
-      <w:proofErr w:type="spellEnd"/>
+    </w:p>
+    <w:p>
+      <w:pPr>
+        <w:spacing w:before="120" w:after="60"/>
+        <w:rPr>
+          <w:rFonts w:cs="Arial"/>
+          <w:color w:val="000000" w:themeColor="text1"/>
+          <w:lang w:val="pt-BR"/>
+        </w:rPr>
+      </w:pPr>
       <w:r>
         <w:rPr>
           <w:rFonts w:cs="Arial"/>
           <w:color w:val="000000" w:themeColor="text1"/>
           <w:lang w:val="pt-BR"/>
         </w:rPr>
-        <w:t>.</w:t>
+        <w:t>- Plataforma: Azure Functions.</w:t>
       </w:r>
     </w:p>
     <w:p>
@@ -2374,97 +1807,7 @@
           <w:color w:val="000000" w:themeColor="text1"/>
           <w:lang w:val="pt-BR"/>
         </w:rPr>
-        <w:t xml:space="preserve">- </w:t>
-      </w:r>
-      <w:proofErr w:type="spellStart"/>
-      <w:r>
-        <w:rPr>
-          <w:rFonts w:cs="Arial"/>
-          <w:color w:val="000000" w:themeColor="text1"/>
-          <w:lang w:val="pt-BR"/>
-        </w:rPr>
-        <w:t>Runtime</w:t>
-      </w:r>
-      <w:proofErr w:type="spellEnd"/>
-      <w:r>
-        <w:rPr>
-          <w:rFonts w:cs="Arial"/>
-          <w:color w:val="000000" w:themeColor="text1"/>
-          <w:lang w:val="pt-BR"/>
-        </w:rPr>
-        <w:t>: Node.js, conforme a implementação desenvolvida.</w:t>
-      </w:r>
-    </w:p>
-    <w:p>
-      <w:pPr>
-        <w:spacing w:before="120" w:after="60"/>
-        <w:rPr>
-          <w:rFonts w:cs="Arial"/>
-          <w:color w:val="000000" w:themeColor="text1"/>
-          <w:lang w:val="pt-BR"/>
-        </w:rPr>
-      </w:pPr>
-      <w:r>
-        <w:rPr>
-          <w:rFonts w:cs="Arial"/>
-          <w:color w:val="000000" w:themeColor="text1"/>
-          <w:lang w:val="pt-BR"/>
-        </w:rPr>
-        <w:t xml:space="preserve">- Plataforma: Azure </w:t>
-      </w:r>
-      <w:proofErr w:type="spellStart"/>
-      <w:r>
-        <w:rPr>
-          <w:rFonts w:cs="Arial"/>
-          <w:color w:val="000000" w:themeColor="text1"/>
-          <w:lang w:val="pt-BR"/>
-        </w:rPr>
-        <w:t>Functions</w:t>
-      </w:r>
-      <w:proofErr w:type="spellEnd"/>
-      <w:r>
-        <w:rPr>
-          <w:rFonts w:cs="Arial"/>
-          <w:color w:val="000000" w:themeColor="text1"/>
-          <w:lang w:val="pt-BR"/>
-        </w:rPr>
-        <w:t>.</w:t>
-      </w:r>
-    </w:p>
-    <w:p>
-      <w:pPr>
-        <w:spacing w:before="120" w:after="60"/>
-        <w:rPr>
-          <w:rFonts w:cs="Arial"/>
-          <w:color w:val="000000" w:themeColor="text1"/>
-          <w:lang w:val="pt-BR"/>
-        </w:rPr>
-      </w:pPr>
-      <w:r>
-        <w:rPr>
-          <w:rFonts w:cs="Arial"/>
-          <w:color w:val="000000" w:themeColor="text1"/>
-          <w:lang w:val="pt-BR"/>
-        </w:rPr>
-        <w:t>- Região: North Central US (</w:t>
-      </w:r>
-      <w:proofErr w:type="spellStart"/>
-      <w:r>
-        <w:rPr>
-          <w:rFonts w:cs="Arial"/>
-          <w:color w:val="000000" w:themeColor="text1"/>
-          <w:lang w:val="pt-BR"/>
-        </w:rPr>
-        <w:t>northcentralus</w:t>
-      </w:r>
-      <w:proofErr w:type="spellEnd"/>
-      <w:r>
-        <w:rPr>
-          <w:rFonts w:cs="Arial"/>
-          <w:color w:val="000000" w:themeColor="text1"/>
-          <w:lang w:val="pt-BR"/>
-        </w:rPr>
-        <w:t>).</w:t>
+        <w:t>- Região: North Central US (northcentralus).</w:t>
       </w:r>
     </w:p>
     <w:p>
@@ -2793,47 +2136,7 @@
           <w:color w:val="000000" w:themeColor="text1"/>
           <w:sz w:val="22"/>
         </w:rPr>
-        <w:t xml:space="preserve">.4 </w:t>
-      </w:r>
-      <w:proofErr w:type="spellStart"/>
-      <w:r>
-        <w:rPr>
-          <w:rFonts w:cs="Arial"/>
-          <w:b/>
-          <w:color w:val="000000" w:themeColor="text1"/>
-          <w:sz w:val="22"/>
-        </w:rPr>
-        <w:t>Tratamento</w:t>
-      </w:r>
-      <w:proofErr w:type="spellEnd"/>
-      <w:r>
-        <w:rPr>
-          <w:rFonts w:cs="Arial"/>
-          <w:b/>
-          <w:color w:val="000000" w:themeColor="text1"/>
-          <w:sz w:val="22"/>
-        </w:rPr>
-        <w:t xml:space="preserve"> </w:t>
-      </w:r>
-      <w:proofErr w:type="spellStart"/>
-      <w:r>
-        <w:rPr>
-          <w:rFonts w:cs="Arial"/>
-          <w:b/>
-          <w:color w:val="000000" w:themeColor="text1"/>
-          <w:sz w:val="22"/>
-        </w:rPr>
-        <w:t>comum</w:t>
-      </w:r>
-      <w:proofErr w:type="spellEnd"/>
-      <w:r>
-        <w:rPr>
-          <w:rFonts w:cs="Arial"/>
-          <w:b/>
-          <w:color w:val="000000" w:themeColor="text1"/>
-          <w:sz w:val="22"/>
-        </w:rPr>
-        <w:t xml:space="preserve"> das APIs</w:t>
+        <w:t>.4 Tratamento comum das APIs</w:t>
       </w:r>
     </w:p>
     <w:tbl>
@@ -3524,7 +2827,6 @@
                 <w:color w:val="FFFFFF" w:themeColor="background1"/>
               </w:rPr>
             </w:pPr>
-            <w:proofErr w:type="spellStart"/>
             <w:r>
               <w:rPr>
                 <w:rFonts w:cs="Arial"/>
@@ -3534,7 +2836,6 @@
               </w:rPr>
               <w:t>Provedor</w:t>
             </w:r>
-            <w:proofErr w:type="spellEnd"/>
           </w:p>
         </w:tc>
         <w:tc>
@@ -3750,18 +3051,8 @@
                 <w:color w:val="000000" w:themeColor="text1"/>
                 <w:sz w:val="16"/>
               </w:rPr>
-              <w:t xml:space="preserve">2.125 </w:t>
+              <w:t>2.125 ms</w:t>
             </w:r>
-            <w:proofErr w:type="spellStart"/>
-            <w:r>
-              <w:rPr>
-                <w:rFonts w:cs="Arial"/>
-                <w:color w:val="000000" w:themeColor="text1"/>
-                <w:sz w:val="16"/>
-              </w:rPr>
-              <w:t>ms</w:t>
-            </w:r>
-            <w:proofErr w:type="spellEnd"/>
           </w:p>
         </w:tc>
         <w:tc>
@@ -3789,18 +3080,8 @@
                 <w:color w:val="000000" w:themeColor="text1"/>
                 <w:sz w:val="16"/>
               </w:rPr>
-              <w:t xml:space="preserve">159 </w:t>
+              <w:t>159 ms</w:t>
             </w:r>
-            <w:proofErr w:type="spellStart"/>
-            <w:r>
-              <w:rPr>
-                <w:rFonts w:cs="Arial"/>
-                <w:color w:val="000000" w:themeColor="text1"/>
-                <w:sz w:val="16"/>
-              </w:rPr>
-              <w:t>ms</w:t>
-            </w:r>
-            <w:proofErr w:type="spellEnd"/>
           </w:p>
         </w:tc>
       </w:tr>
@@ -3863,18 +3144,8 @@
                 <w:color w:val="000000" w:themeColor="text1"/>
                 <w:sz w:val="16"/>
               </w:rPr>
-              <w:t xml:space="preserve">181 </w:t>
+              <w:t>181 ms</w:t>
             </w:r>
-            <w:proofErr w:type="spellStart"/>
-            <w:r>
-              <w:rPr>
-                <w:rFonts w:cs="Arial"/>
-                <w:color w:val="000000" w:themeColor="text1"/>
-                <w:sz w:val="16"/>
-              </w:rPr>
-              <w:t>ms</w:t>
-            </w:r>
-            <w:proofErr w:type="spellEnd"/>
           </w:p>
         </w:tc>
         <w:tc>
@@ -3902,18 +3173,8 @@
                 <w:color w:val="000000" w:themeColor="text1"/>
                 <w:sz w:val="16"/>
               </w:rPr>
-              <w:t xml:space="preserve">24 </w:t>
+              <w:t>24 ms</w:t>
             </w:r>
-            <w:proofErr w:type="spellStart"/>
-            <w:r>
-              <w:rPr>
-                <w:rFonts w:cs="Arial"/>
-                <w:color w:val="000000" w:themeColor="text1"/>
-                <w:sz w:val="16"/>
-              </w:rPr>
-              <w:t>ms</w:t>
-            </w:r>
-            <w:proofErr w:type="spellEnd"/>
           </w:p>
         </w:tc>
       </w:tr>
@@ -4007,7 +3268,6 @@
                 <w:color w:val="FFFFFF" w:themeColor="background1"/>
               </w:rPr>
             </w:pPr>
-            <w:proofErr w:type="spellStart"/>
             <w:r>
               <w:rPr>
                 <w:rFonts w:cs="Arial"/>
@@ -4017,7 +3277,6 @@
               </w:rPr>
               <w:t>Aspecto</w:t>
             </w:r>
-            <w:proofErr w:type="spellEnd"/>
           </w:p>
         </w:tc>
         <w:tc>
@@ -4198,223 +3457,7 @@
                 <w:color w:val="000000" w:themeColor="text1"/>
                 <w:sz w:val="15"/>
               </w:rPr>
-              <w:t xml:space="preserve">A </w:t>
-            </w:r>
-            <w:proofErr w:type="spellStart"/>
-            <w:r>
-              <w:rPr>
-                <w:rFonts w:cs="Arial"/>
-                <w:color w:val="000000" w:themeColor="text1"/>
-                <w:sz w:val="15"/>
-              </w:rPr>
-              <w:t>configuração</w:t>
-            </w:r>
-            <w:proofErr w:type="spellEnd"/>
-            <w:r>
-              <w:rPr>
-                <w:rFonts w:cs="Arial"/>
-                <w:color w:val="000000" w:themeColor="text1"/>
-                <w:sz w:val="15"/>
-              </w:rPr>
-              <w:t xml:space="preserve"> </w:t>
-            </w:r>
-            <w:proofErr w:type="spellStart"/>
-            <w:r>
-              <w:rPr>
-                <w:rFonts w:cs="Arial"/>
-                <w:color w:val="000000" w:themeColor="text1"/>
-                <w:sz w:val="15"/>
-              </w:rPr>
-              <w:t>utilizada</w:t>
-            </w:r>
-            <w:proofErr w:type="spellEnd"/>
-            <w:r>
-              <w:rPr>
-                <w:rFonts w:cs="Arial"/>
-                <w:color w:val="000000" w:themeColor="text1"/>
-                <w:sz w:val="15"/>
-              </w:rPr>
-              <w:t xml:space="preserve"> no </w:t>
-            </w:r>
-            <w:proofErr w:type="spellStart"/>
-            <w:r>
-              <w:rPr>
-                <w:rFonts w:cs="Arial"/>
-                <w:color w:val="000000" w:themeColor="text1"/>
-                <w:sz w:val="15"/>
-              </w:rPr>
-              <w:t>desenvolvimento</w:t>
-            </w:r>
-            <w:proofErr w:type="spellEnd"/>
-            <w:r>
-              <w:rPr>
-                <w:rFonts w:cs="Arial"/>
-                <w:color w:val="000000" w:themeColor="text1"/>
-                <w:sz w:val="15"/>
-              </w:rPr>
-              <w:t xml:space="preserve"> </w:t>
-            </w:r>
-            <w:proofErr w:type="spellStart"/>
-            <w:r>
-              <w:rPr>
-                <w:rFonts w:cs="Arial"/>
-                <w:color w:val="000000" w:themeColor="text1"/>
-                <w:sz w:val="15"/>
-              </w:rPr>
-              <w:t>permite</w:t>
-            </w:r>
-            <w:proofErr w:type="spellEnd"/>
-            <w:r>
-              <w:rPr>
-                <w:rFonts w:cs="Arial"/>
-                <w:color w:val="000000" w:themeColor="text1"/>
-                <w:sz w:val="15"/>
-              </w:rPr>
-              <w:t xml:space="preserve"> </w:t>
-            </w:r>
-            <w:proofErr w:type="spellStart"/>
-            <w:r>
-              <w:rPr>
-                <w:rFonts w:cs="Arial"/>
-                <w:color w:val="000000" w:themeColor="text1"/>
-                <w:sz w:val="15"/>
-              </w:rPr>
-              <w:t>chamadas</w:t>
-            </w:r>
-            <w:proofErr w:type="spellEnd"/>
-            <w:r>
-              <w:rPr>
-                <w:rFonts w:cs="Arial"/>
-                <w:color w:val="000000" w:themeColor="text1"/>
-                <w:sz w:val="15"/>
-              </w:rPr>
-              <w:t xml:space="preserve"> </w:t>
-            </w:r>
-            <w:proofErr w:type="spellStart"/>
-            <w:r>
-              <w:rPr>
-                <w:rFonts w:cs="Arial"/>
-                <w:color w:val="000000" w:themeColor="text1"/>
-                <w:sz w:val="15"/>
-              </w:rPr>
-              <w:t>anônimas</w:t>
-            </w:r>
-            <w:proofErr w:type="spellEnd"/>
-            <w:r>
-              <w:rPr>
-                <w:rFonts w:cs="Arial"/>
-                <w:color w:val="000000" w:themeColor="text1"/>
-                <w:sz w:val="15"/>
-              </w:rPr>
-              <w:t xml:space="preserve">, </w:t>
-            </w:r>
-            <w:proofErr w:type="spellStart"/>
-            <w:r>
-              <w:rPr>
-                <w:rFonts w:cs="Arial"/>
-                <w:color w:val="000000" w:themeColor="text1"/>
-                <w:sz w:val="15"/>
-              </w:rPr>
-              <w:t>sem</w:t>
-            </w:r>
-            <w:proofErr w:type="spellEnd"/>
-            <w:r>
-              <w:rPr>
-                <w:rFonts w:cs="Arial"/>
-                <w:color w:val="000000" w:themeColor="text1"/>
-                <w:sz w:val="15"/>
-              </w:rPr>
-              <w:t xml:space="preserve"> </w:t>
-            </w:r>
-            <w:proofErr w:type="spellStart"/>
-            <w:r>
-              <w:rPr>
-                <w:rFonts w:cs="Arial"/>
-                <w:color w:val="000000" w:themeColor="text1"/>
-                <w:sz w:val="15"/>
-              </w:rPr>
-              <w:t>exigir</w:t>
-            </w:r>
-            <w:proofErr w:type="spellEnd"/>
-            <w:r>
-              <w:rPr>
-                <w:rFonts w:cs="Arial"/>
-                <w:color w:val="000000" w:themeColor="text1"/>
-                <w:sz w:val="15"/>
-              </w:rPr>
-              <w:t xml:space="preserve"> </w:t>
-            </w:r>
-            <w:proofErr w:type="spellStart"/>
-            <w:r>
-              <w:rPr>
-                <w:rFonts w:cs="Arial"/>
-                <w:color w:val="000000" w:themeColor="text1"/>
-                <w:sz w:val="15"/>
-              </w:rPr>
-              <w:t>uma</w:t>
-            </w:r>
-            <w:proofErr w:type="spellEnd"/>
-            <w:r>
-              <w:rPr>
-                <w:rFonts w:cs="Arial"/>
-                <w:color w:val="000000" w:themeColor="text1"/>
-                <w:sz w:val="15"/>
-              </w:rPr>
-              <w:t xml:space="preserve"> </w:t>
-            </w:r>
-            <w:proofErr w:type="spellStart"/>
-            <w:r>
-              <w:rPr>
-                <w:rFonts w:cs="Arial"/>
-                <w:color w:val="000000" w:themeColor="text1"/>
-                <w:sz w:val="15"/>
-              </w:rPr>
-              <w:t>chave</w:t>
-            </w:r>
-            <w:proofErr w:type="spellEnd"/>
-            <w:r>
-              <w:rPr>
-                <w:rFonts w:cs="Arial"/>
-                <w:color w:val="000000" w:themeColor="text1"/>
-                <w:sz w:val="15"/>
-              </w:rPr>
-              <w:t xml:space="preserve"> de </w:t>
-            </w:r>
-            <w:proofErr w:type="spellStart"/>
-            <w:r>
-              <w:rPr>
-                <w:rFonts w:cs="Arial"/>
-                <w:color w:val="000000" w:themeColor="text1"/>
-                <w:sz w:val="15"/>
-              </w:rPr>
-              <w:t>função</w:t>
-            </w:r>
-            <w:proofErr w:type="spellEnd"/>
-            <w:r>
-              <w:rPr>
-                <w:rFonts w:cs="Arial"/>
-                <w:color w:val="000000" w:themeColor="text1"/>
-                <w:sz w:val="15"/>
-              </w:rPr>
-              <w:t xml:space="preserve"> no </w:t>
-            </w:r>
-            <w:proofErr w:type="spellStart"/>
-            <w:r>
-              <w:rPr>
-                <w:rFonts w:cs="Arial"/>
-                <w:color w:val="000000" w:themeColor="text1"/>
-                <w:sz w:val="15"/>
-              </w:rPr>
-              <w:t>cliente</w:t>
-            </w:r>
-            <w:proofErr w:type="spellEnd"/>
-            <w:r>
-              <w:rPr>
-                <w:rFonts w:cs="Arial"/>
-                <w:color w:val="000000" w:themeColor="text1"/>
-                <w:sz w:val="15"/>
-              </w:rPr>
-              <w:t>.</w:t>
+              <w:t>A configuração utilizada no desenvolvimento permite chamadas anônimas, sem exigir uma chave de função no cliente.</w:t>
             </w:r>
           </w:p>
         </w:tc>
@@ -4443,25 +3486,7 @@
                 <w:color w:val="000000" w:themeColor="text1"/>
                 <w:sz w:val="15"/>
               </w:rPr>
-              <w:t xml:space="preserve">Definir identidade de execução e permissão de invocação HTTP; avaliar explicitamente </w:t>
-            </w:r>
-            <w:proofErr w:type="gramStart"/>
-            <w:r>
-              <w:rPr>
-                <w:rFonts w:cs="Arial"/>
-                <w:color w:val="000000" w:themeColor="text1"/>
-                <w:sz w:val="15"/>
-              </w:rPr>
-              <w:t>a</w:t>
-            </w:r>
-            <w:proofErr w:type="gramEnd"/>
-            <w:r>
-              <w:rPr>
-                <w:rFonts w:cs="Arial"/>
-                <w:color w:val="000000" w:themeColor="text1"/>
-                <w:sz w:val="15"/>
-              </w:rPr>
-              <w:t xml:space="preserve"> exposição pública.</w:t>
+              <w:t>Definir identidade de execução e permissão de invocação HTTP; avaliar explicitamente a exposição pública.</w:t>
             </w:r>
           </w:p>
         </w:tc>
@@ -4553,151 +3578,7 @@
                 <w:color w:val="000000" w:themeColor="text1"/>
                 <w:sz w:val="15"/>
               </w:rPr>
-              <w:t xml:space="preserve">A URL </w:t>
-            </w:r>
-            <w:proofErr w:type="spellStart"/>
-            <w:r>
-              <w:rPr>
-                <w:rFonts w:cs="Arial"/>
-                <w:color w:val="000000" w:themeColor="text1"/>
-                <w:sz w:val="15"/>
-              </w:rPr>
-              <w:t>pública</w:t>
-            </w:r>
-            <w:proofErr w:type="spellEnd"/>
-            <w:r>
-              <w:rPr>
-                <w:rFonts w:cs="Arial"/>
-                <w:color w:val="000000" w:themeColor="text1"/>
-                <w:sz w:val="15"/>
-              </w:rPr>
-              <w:t xml:space="preserve"> do frontend </w:t>
-            </w:r>
-            <w:proofErr w:type="spellStart"/>
-            <w:r>
-              <w:rPr>
-                <w:rFonts w:cs="Arial"/>
-                <w:color w:val="000000" w:themeColor="text1"/>
-                <w:sz w:val="15"/>
-              </w:rPr>
-              <w:t>hospedado</w:t>
-            </w:r>
-            <w:proofErr w:type="spellEnd"/>
-            <w:r>
-              <w:rPr>
-                <w:rFonts w:cs="Arial"/>
-                <w:color w:val="000000" w:themeColor="text1"/>
-                <w:sz w:val="15"/>
-              </w:rPr>
-              <w:t xml:space="preserve"> no Railway </w:t>
-            </w:r>
-            <w:proofErr w:type="spellStart"/>
-            <w:r>
-              <w:rPr>
-                <w:rFonts w:cs="Arial"/>
-                <w:color w:val="000000" w:themeColor="text1"/>
-                <w:sz w:val="15"/>
-              </w:rPr>
-              <w:t>foi</w:t>
-            </w:r>
-            <w:proofErr w:type="spellEnd"/>
-            <w:r>
-              <w:rPr>
-                <w:rFonts w:cs="Arial"/>
-                <w:color w:val="000000" w:themeColor="text1"/>
-                <w:sz w:val="15"/>
-              </w:rPr>
-              <w:t xml:space="preserve"> </w:t>
-            </w:r>
-            <w:proofErr w:type="spellStart"/>
-            <w:r>
-              <w:rPr>
-                <w:rFonts w:cs="Arial"/>
-                <w:color w:val="000000" w:themeColor="text1"/>
-                <w:sz w:val="15"/>
-              </w:rPr>
-              <w:t>configurada</w:t>
-            </w:r>
-            <w:proofErr w:type="spellEnd"/>
-            <w:r>
-              <w:rPr>
-                <w:rFonts w:cs="Arial"/>
-                <w:color w:val="000000" w:themeColor="text1"/>
-                <w:sz w:val="15"/>
-              </w:rPr>
-              <w:t xml:space="preserve"> no CORS da Azure Function para </w:t>
-            </w:r>
-            <w:proofErr w:type="spellStart"/>
-            <w:r>
-              <w:rPr>
-                <w:rFonts w:cs="Arial"/>
-                <w:color w:val="000000" w:themeColor="text1"/>
-                <w:sz w:val="15"/>
-              </w:rPr>
-              <w:t>permitir</w:t>
-            </w:r>
-            <w:proofErr w:type="spellEnd"/>
-            <w:r>
-              <w:rPr>
-                <w:rFonts w:cs="Arial"/>
-                <w:color w:val="000000" w:themeColor="text1"/>
-                <w:sz w:val="15"/>
-              </w:rPr>
-              <w:t xml:space="preserve"> as </w:t>
-            </w:r>
-            <w:proofErr w:type="spellStart"/>
-            <w:r>
-              <w:rPr>
-                <w:rFonts w:cs="Arial"/>
-                <w:color w:val="000000" w:themeColor="text1"/>
-                <w:sz w:val="15"/>
-              </w:rPr>
-              <w:t>requisições</w:t>
-            </w:r>
-            <w:proofErr w:type="spellEnd"/>
-            <w:r>
-              <w:rPr>
-                <w:rFonts w:cs="Arial"/>
-                <w:color w:val="000000" w:themeColor="text1"/>
-                <w:sz w:val="15"/>
-              </w:rPr>
-              <w:t xml:space="preserve"> </w:t>
-            </w:r>
-            <w:proofErr w:type="spellStart"/>
-            <w:r>
-              <w:rPr>
-                <w:rFonts w:cs="Arial"/>
-                <w:color w:val="000000" w:themeColor="text1"/>
-                <w:sz w:val="15"/>
-              </w:rPr>
-              <w:t>originadas</w:t>
-            </w:r>
-            <w:proofErr w:type="spellEnd"/>
-            <w:r>
-              <w:rPr>
-                <w:rFonts w:cs="Arial"/>
-                <w:color w:val="000000" w:themeColor="text1"/>
-                <w:sz w:val="15"/>
-              </w:rPr>
-              <w:t xml:space="preserve"> da </w:t>
-            </w:r>
-            <w:proofErr w:type="spellStart"/>
-            <w:r>
-              <w:rPr>
-                <w:rFonts w:cs="Arial"/>
-                <w:color w:val="000000" w:themeColor="text1"/>
-                <w:sz w:val="15"/>
-              </w:rPr>
-              <w:t>aplicação</w:t>
-            </w:r>
-            <w:proofErr w:type="spellEnd"/>
-            <w:r>
-              <w:rPr>
-                <w:rFonts w:cs="Arial"/>
-                <w:color w:val="000000" w:themeColor="text1"/>
-                <w:sz w:val="15"/>
-              </w:rPr>
-              <w:t>.</w:t>
+              <w:t>A URL pública do frontend hospedado no Railway foi configurada no CORS da Azure Function para permitir as requisições originadas da aplicação.</w:t>
             </w:r>
           </w:p>
         </w:tc>
@@ -4789,79 +3670,7 @@
                 <w:color w:val="000000" w:themeColor="text1"/>
                 <w:sz w:val="15"/>
               </w:rPr>
-              <w:t xml:space="preserve">CloudWatch Logs e </w:t>
-            </w:r>
-            <w:proofErr w:type="spellStart"/>
-            <w:r>
-              <w:rPr>
-                <w:rFonts w:cs="Arial"/>
-                <w:color w:val="000000" w:themeColor="text1"/>
-                <w:sz w:val="15"/>
-              </w:rPr>
-              <w:t>métricas</w:t>
-            </w:r>
-            <w:proofErr w:type="spellEnd"/>
-            <w:r>
-              <w:rPr>
-                <w:rFonts w:cs="Arial"/>
-                <w:color w:val="000000" w:themeColor="text1"/>
-                <w:sz w:val="15"/>
-              </w:rPr>
-              <w:t xml:space="preserve"> de </w:t>
-            </w:r>
-            <w:proofErr w:type="spellStart"/>
-            <w:r>
-              <w:rPr>
-                <w:rFonts w:cs="Arial"/>
-                <w:color w:val="000000" w:themeColor="text1"/>
-                <w:sz w:val="15"/>
-              </w:rPr>
-              <w:t>duração</w:t>
-            </w:r>
-            <w:proofErr w:type="spellEnd"/>
-            <w:r>
-              <w:rPr>
-                <w:rFonts w:cs="Arial"/>
-                <w:color w:val="000000" w:themeColor="text1"/>
-                <w:sz w:val="15"/>
-              </w:rPr>
-              <w:t xml:space="preserve">, </w:t>
-            </w:r>
-            <w:proofErr w:type="spellStart"/>
-            <w:r>
-              <w:rPr>
-                <w:rFonts w:cs="Arial"/>
-                <w:color w:val="000000" w:themeColor="text1"/>
-                <w:sz w:val="15"/>
-              </w:rPr>
-              <w:t>invocações</w:t>
-            </w:r>
-            <w:proofErr w:type="spellEnd"/>
-            <w:r>
-              <w:rPr>
-                <w:rFonts w:cs="Arial"/>
-                <w:color w:val="000000" w:themeColor="text1"/>
-                <w:sz w:val="15"/>
-              </w:rPr>
-              <w:t xml:space="preserve"> e </w:t>
-            </w:r>
-            <w:proofErr w:type="spellStart"/>
-            <w:r>
-              <w:rPr>
-                <w:rFonts w:cs="Arial"/>
-                <w:color w:val="000000" w:themeColor="text1"/>
-                <w:sz w:val="15"/>
-              </w:rPr>
-              <w:t>erros</w:t>
-            </w:r>
-            <w:proofErr w:type="spellEnd"/>
-            <w:r>
-              <w:rPr>
-                <w:rFonts w:cs="Arial"/>
-                <w:color w:val="000000" w:themeColor="text1"/>
-                <w:sz w:val="15"/>
-              </w:rPr>
-              <w:t>.</w:t>
+              <w:t>CloudWatch Logs e métricas de duração, invocações e erros.</w:t>
             </w:r>
           </w:p>
         </w:tc>
@@ -4952,96 +3761,6 @@
           <w:p>
             <w:pPr>
               <w:spacing w:after="0"/>
-              <w:rPr>
-                <w:rFonts w:cs="Arial"/>
-                <w:color w:val="000000" w:themeColor="text1"/>
-                <w:sz w:val="15"/>
-              </w:rPr>
-            </w:pPr>
-            <w:r>
-              <w:rPr>
-                <w:rFonts w:cs="Arial"/>
-                <w:color w:val="000000" w:themeColor="text1"/>
-                <w:sz w:val="15"/>
-              </w:rPr>
-              <w:t xml:space="preserve">Cloud Logging e </w:t>
-            </w:r>
-            <w:proofErr w:type="spellStart"/>
-            <w:r>
-              <w:rPr>
-                <w:rFonts w:cs="Arial"/>
-                <w:color w:val="000000" w:themeColor="text1"/>
-                <w:sz w:val="15"/>
-              </w:rPr>
-              <w:t>métricas</w:t>
-            </w:r>
-            <w:proofErr w:type="spellEnd"/>
-            <w:r>
-              <w:rPr>
-                <w:rFonts w:cs="Arial"/>
-                <w:color w:val="000000" w:themeColor="text1"/>
-                <w:sz w:val="15"/>
-              </w:rPr>
-              <w:t xml:space="preserve"> de </w:t>
-            </w:r>
-            <w:proofErr w:type="spellStart"/>
-            <w:r>
-              <w:rPr>
-                <w:rFonts w:cs="Arial"/>
-                <w:color w:val="000000" w:themeColor="text1"/>
-                <w:sz w:val="15"/>
-              </w:rPr>
-              <w:t>execução</w:t>
-            </w:r>
-            <w:proofErr w:type="spellEnd"/>
-            <w:r>
-              <w:rPr>
-                <w:rFonts w:cs="Arial"/>
-                <w:color w:val="000000" w:themeColor="text1"/>
-                <w:sz w:val="15"/>
-              </w:rPr>
-              <w:t xml:space="preserve">, </w:t>
-            </w:r>
-            <w:proofErr w:type="spellStart"/>
-            <w:r>
-              <w:rPr>
-                <w:rFonts w:cs="Arial"/>
-                <w:color w:val="000000" w:themeColor="text1"/>
-                <w:sz w:val="15"/>
-              </w:rPr>
-              <w:t>duração</w:t>
-            </w:r>
-            <w:proofErr w:type="spellEnd"/>
-            <w:r>
-              <w:rPr>
-                <w:rFonts w:cs="Arial"/>
-                <w:color w:val="000000" w:themeColor="text1"/>
-                <w:sz w:val="15"/>
-              </w:rPr>
-              <w:t xml:space="preserve"> e </w:t>
-            </w:r>
-            <w:proofErr w:type="spellStart"/>
-            <w:r>
-              <w:rPr>
-                <w:rFonts w:cs="Arial"/>
-                <w:color w:val="000000" w:themeColor="text1"/>
-                <w:sz w:val="15"/>
-              </w:rPr>
-              <w:t>erros</w:t>
-            </w:r>
-            <w:proofErr w:type="spellEnd"/>
-            <w:r>
-              <w:rPr>
-                <w:rFonts w:cs="Arial"/>
-                <w:color w:val="000000" w:themeColor="text1"/>
-                <w:sz w:val="15"/>
-              </w:rPr>
-              <w:t>.</w:t>
-            </w:r>
-          </w:p>
-          <w:p>
-            <w:pPr>
-              <w:spacing w:after="0"/>
               <w:jc w:val="center"/>
               <w:rPr>
                 <w:rFonts w:cs="Arial"/>
@@ -5251,128 +3970,20 @@
           <w:p>
             <w:pPr>
               <w:spacing w:after="0"/>
-              <w:rPr>
-                <w:rFonts w:cs="Arial"/>
-                <w:color w:val="000000" w:themeColor="text1"/>
-                <w:sz w:val="15"/>
+              <w:jc w:val="center"/>
+              <w:rPr>
+                <w:rFonts w:cs="Arial"/>
+                <w:color w:val="000000" w:themeColor="text1"/>
               </w:rPr>
             </w:pPr>
             <w:r>
               <w:rPr>
-                <w:rFonts w:cs="Arial"/>
-                <w:color w:val="000000" w:themeColor="text1"/>
-                <w:sz w:val="15"/>
-              </w:rPr>
-              <w:t xml:space="preserve">Publicar função HTTP, </w:t>
-            </w:r>
-            <w:proofErr w:type="spellStart"/>
-            <w:r>
-              <w:rPr>
-                <w:rFonts w:cs="Arial"/>
-                <w:color w:val="000000" w:themeColor="text1"/>
-                <w:sz w:val="15"/>
-              </w:rPr>
-              <w:t>selecionar</w:t>
-            </w:r>
-            <w:proofErr w:type="spellEnd"/>
-            <w:r>
-              <w:rPr>
-                <w:rFonts w:cs="Arial"/>
-                <w:color w:val="000000" w:themeColor="text1"/>
-                <w:sz w:val="15"/>
-              </w:rPr>
-              <w:t xml:space="preserve"> runtime/</w:t>
-            </w:r>
-            <w:proofErr w:type="spellStart"/>
-            <w:r>
-              <w:rPr>
-                <w:rFonts w:cs="Arial"/>
-                <w:color w:val="000000" w:themeColor="text1"/>
-                <w:sz w:val="15"/>
-              </w:rPr>
-              <w:t>região</w:t>
-            </w:r>
-            <w:proofErr w:type="spellEnd"/>
-            <w:r>
-              <w:rPr>
-                <w:rFonts w:cs="Arial"/>
-                <w:color w:val="000000" w:themeColor="text1"/>
-                <w:sz w:val="15"/>
-              </w:rPr>
-              <w:t xml:space="preserve"> e </w:t>
-            </w:r>
-            <w:proofErr w:type="spellStart"/>
-            <w:r>
-              <w:rPr>
-                <w:rFonts w:cs="Arial"/>
-                <w:color w:val="000000" w:themeColor="text1"/>
-                <w:sz w:val="15"/>
-              </w:rPr>
-              <w:t>definir</w:t>
-            </w:r>
-            <w:proofErr w:type="spellEnd"/>
-            <w:r>
-              <w:rPr>
-                <w:rFonts w:cs="Arial"/>
-                <w:color w:val="000000" w:themeColor="text1"/>
-                <w:sz w:val="15"/>
-              </w:rPr>
-              <w:t xml:space="preserve"> </w:t>
-            </w:r>
-            <w:proofErr w:type="spellStart"/>
-            <w:r>
-              <w:rPr>
-                <w:rFonts w:cs="Arial"/>
-                <w:color w:val="000000" w:themeColor="text1"/>
-                <w:sz w:val="15"/>
-              </w:rPr>
-              <w:t>política</w:t>
-            </w:r>
-            <w:proofErr w:type="spellEnd"/>
-            <w:r>
-              <w:rPr>
-                <w:rFonts w:cs="Arial"/>
-                <w:color w:val="000000" w:themeColor="text1"/>
-                <w:sz w:val="15"/>
-              </w:rPr>
-              <w:t xml:space="preserve"> de </w:t>
-            </w:r>
-            <w:proofErr w:type="spellStart"/>
-            <w:r>
-              <w:rPr>
-                <w:rFonts w:cs="Arial"/>
-                <w:color w:val="000000" w:themeColor="text1"/>
-                <w:sz w:val="15"/>
-              </w:rPr>
-              <w:t>invocação</w:t>
-            </w:r>
-            <w:proofErr w:type="spellEnd"/>
-            <w:r>
-              <w:rPr>
-                <w:rFonts w:cs="Arial"/>
-                <w:color w:val="000000" w:themeColor="text1"/>
-                <w:sz w:val="15"/>
-              </w:rPr>
-              <w:t>.</w:t>
-            </w:r>
-          </w:p>
-          <w:p>
-            <w:pPr>
-              <w:spacing w:after="0"/>
-              <w:jc w:val="center"/>
-              <w:rPr>
-                <w:rFonts w:cs="Arial"/>
-                <w:color w:val="000000" w:themeColor="text1"/>
-              </w:rPr>
-            </w:pPr>
-            <w:r>
-              <w:rPr>
                 <w:noProof/>
               </w:rPr>
               <w:drawing>
-                <wp:inline distT="0" distB="0" distL="0" distR="0" wp14:anchorId="02E1E2BA" wp14:editId="183DB7DE">
-                  <wp:extent cx="1203267" cy="625475"/>
-                  <wp:effectExtent l="0" t="0" r="0" b="3175"/>
+                <wp:inline distT="0" distB="0" distL="0" distR="0" wp14:anchorId="02E1E2BA" wp14:editId="6CD1B571">
+                  <wp:extent cx="1429261" cy="742950"/>
+                  <wp:effectExtent l="0" t="0" r="0" b="0"/>
                   <wp:docPr id="1858634927" name="Imagem 1"/>
                   <wp:cNvGraphicFramePr>
                     <a:graphicFrameLocks xmlns:a="http://schemas.openxmlformats.org/drawingml/2006/main" noChangeAspect="1"/>
@@ -5393,7 +4004,7 @@
                         <pic:spPr>
                           <a:xfrm>
                             <a:off x="0" y="0"/>
-                            <a:ext cx="1265374" cy="657759"/>
+                            <a:ext cx="1507377" cy="783556"/>
                           </a:xfrm>
                           <a:prstGeom prst="rect">
                             <a:avLst/>
@@ -5431,7 +4042,6 @@
                 <w:color w:val="000000" w:themeColor="text1"/>
               </w:rPr>
             </w:pPr>
-            <w:proofErr w:type="spellStart"/>
             <w:r>
               <w:rPr>
                 <w:rFonts w:cs="Arial"/>
@@ -5439,27 +4049,8 @@
                 <w:sz w:val="15"/>
               </w:rPr>
               <w:lastRenderedPageBreak/>
-              <w:t>Validação</w:t>
+              <w:t>Validação funcional</w:t>
             </w:r>
-            <w:proofErr w:type="spellEnd"/>
-            <w:r>
-              <w:rPr>
-                <w:rFonts w:cs="Arial"/>
-                <w:color w:val="000000" w:themeColor="text1"/>
-                <w:sz w:val="15"/>
-              </w:rPr>
-              <w:t xml:space="preserve"> </w:t>
-            </w:r>
-            <w:proofErr w:type="spellStart"/>
-            <w:r>
-              <w:rPr>
-                <w:rFonts w:cs="Arial"/>
-                <w:color w:val="000000" w:themeColor="text1"/>
-                <w:sz w:val="15"/>
-              </w:rPr>
-              <w:t>funcional</w:t>
-            </w:r>
-            <w:proofErr w:type="spellEnd"/>
           </w:p>
         </w:tc>
         <w:tc>
@@ -5578,114 +4169,6 @@
           <w:p>
             <w:pPr>
               <w:spacing w:after="0"/>
-              <w:rPr>
-                <w:rFonts w:cs="Arial"/>
-                <w:color w:val="000000" w:themeColor="text1"/>
-                <w:sz w:val="15"/>
-              </w:rPr>
-            </w:pPr>
-            <w:r>
-              <w:rPr>
-                <w:rFonts w:cs="Arial"/>
-                <w:color w:val="000000" w:themeColor="text1"/>
-                <w:sz w:val="15"/>
-              </w:rPr>
-              <w:t xml:space="preserve">Testar endpoint, JSON, CORS, </w:t>
-            </w:r>
-            <w:proofErr w:type="spellStart"/>
-            <w:r>
-              <w:rPr>
-                <w:rFonts w:cs="Arial"/>
-                <w:color w:val="000000" w:themeColor="text1"/>
-                <w:sz w:val="15"/>
-              </w:rPr>
-              <w:t>permissões</w:t>
-            </w:r>
-            <w:proofErr w:type="spellEnd"/>
-            <w:r>
-              <w:rPr>
-                <w:rFonts w:cs="Arial"/>
-                <w:color w:val="000000" w:themeColor="text1"/>
-                <w:sz w:val="15"/>
-              </w:rPr>
-              <w:t xml:space="preserve"> e </w:t>
-            </w:r>
-            <w:proofErr w:type="spellStart"/>
-            <w:r>
-              <w:rPr>
-                <w:rFonts w:cs="Arial"/>
-                <w:color w:val="000000" w:themeColor="text1"/>
-                <w:sz w:val="15"/>
-              </w:rPr>
-              <w:t>comportamento</w:t>
-            </w:r>
-            <w:proofErr w:type="spellEnd"/>
-            <w:r>
-              <w:rPr>
-                <w:rFonts w:cs="Arial"/>
-                <w:color w:val="000000" w:themeColor="text1"/>
-                <w:sz w:val="15"/>
-              </w:rPr>
-              <w:t xml:space="preserve"> </w:t>
-            </w:r>
-            <w:proofErr w:type="spellStart"/>
-            <w:r>
-              <w:rPr>
-                <w:rFonts w:cs="Arial"/>
-                <w:color w:val="000000" w:themeColor="text1"/>
-                <w:sz w:val="15"/>
-              </w:rPr>
-              <w:t>em</w:t>
-            </w:r>
-            <w:proofErr w:type="spellEnd"/>
-            <w:r>
-              <w:rPr>
-                <w:rFonts w:cs="Arial"/>
-                <w:color w:val="000000" w:themeColor="text1"/>
-                <w:sz w:val="15"/>
-              </w:rPr>
-              <w:t xml:space="preserve"> </w:t>
-            </w:r>
-            <w:proofErr w:type="spellStart"/>
-            <w:r>
-              <w:rPr>
-                <w:rFonts w:cs="Arial"/>
-                <w:color w:val="000000" w:themeColor="text1"/>
-                <w:sz w:val="15"/>
-              </w:rPr>
-              <w:t>caso</w:t>
-            </w:r>
-            <w:proofErr w:type="spellEnd"/>
-            <w:r>
-              <w:rPr>
-                <w:rFonts w:cs="Arial"/>
-                <w:color w:val="000000" w:themeColor="text1"/>
-                <w:sz w:val="15"/>
-              </w:rPr>
-              <w:t xml:space="preserve"> de </w:t>
-            </w:r>
-            <w:proofErr w:type="spellStart"/>
-            <w:r>
-              <w:rPr>
-                <w:rFonts w:cs="Arial"/>
-                <w:color w:val="000000" w:themeColor="text1"/>
-                <w:sz w:val="15"/>
-              </w:rPr>
-              <w:t>falha</w:t>
-            </w:r>
-            <w:proofErr w:type="spellEnd"/>
-            <w:r>
-              <w:rPr>
-                <w:rFonts w:cs="Arial"/>
-                <w:color w:val="000000" w:themeColor="text1"/>
-                <w:sz w:val="15"/>
-              </w:rPr>
-              <w:t>.</w:t>
-            </w:r>
-          </w:p>
-          <w:p>
-            <w:pPr>
-              <w:spacing w:after="0"/>
               <w:jc w:val="center"/>
               <w:rPr>
                 <w:rFonts w:cs="Arial"/>
@@ -5771,59 +4254,8 @@
           <w:color w:val="000000" w:themeColor="text1"/>
           <w:sz w:val="22"/>
         </w:rPr>
-        <w:t xml:space="preserve">.1 </w:t>
+        <w:t>.1 Análise crítica de integração</w:t>
       </w:r>
-      <w:proofErr w:type="spellStart"/>
-      <w:r>
-        <w:rPr>
-          <w:rFonts w:cs="Arial"/>
-          <w:b/>
-          <w:color w:val="000000" w:themeColor="text1"/>
-          <w:sz w:val="22"/>
-        </w:rPr>
-        <w:t>Análise</w:t>
-      </w:r>
-      <w:proofErr w:type="spellEnd"/>
-      <w:r>
-        <w:rPr>
-          <w:rFonts w:cs="Arial"/>
-          <w:b/>
-          <w:color w:val="000000" w:themeColor="text1"/>
-          <w:sz w:val="22"/>
-        </w:rPr>
-        <w:t xml:space="preserve"> </w:t>
-      </w:r>
-      <w:proofErr w:type="spellStart"/>
-      <w:r>
-        <w:rPr>
-          <w:rFonts w:cs="Arial"/>
-          <w:b/>
-          <w:color w:val="000000" w:themeColor="text1"/>
-          <w:sz w:val="22"/>
-        </w:rPr>
-        <w:t>crítica</w:t>
-      </w:r>
-      <w:proofErr w:type="spellEnd"/>
-      <w:r>
-        <w:rPr>
-          <w:rFonts w:cs="Arial"/>
-          <w:b/>
-          <w:color w:val="000000" w:themeColor="text1"/>
-          <w:sz w:val="22"/>
-        </w:rPr>
-        <w:t xml:space="preserve"> de </w:t>
-      </w:r>
-      <w:proofErr w:type="spellStart"/>
-      <w:r>
-        <w:rPr>
-          <w:rFonts w:cs="Arial"/>
-          <w:b/>
-          <w:color w:val="000000" w:themeColor="text1"/>
-          <w:sz w:val="22"/>
-        </w:rPr>
-        <w:t>integração</w:t>
-      </w:r>
-      <w:proofErr w:type="spellEnd"/>
     </w:p>
     <w:p>
       <w:pPr>
@@ -6549,7 +4981,6 @@
         <w:docPartUnique/>
       </w:docPartObj>
     </w:sdtPr>
-    <w:sdtEndPr/>
     <w:sdtContent>
       <w:p>
         <w:pPr>

</xml_diff>